<commit_message>
new file:   scratch/template_checker.py 	modified:   screens/certificate_screen.py 	modified:   temp_certificate.docx 	new file:   templets/New Text Document.txt 	modified:   templets/semester - Temp - En - D.docx
</commit_message>
<xml_diff>
--- a/temp_certificate.docx
+++ b/temp_certificate.docx
@@ -69,7 +69,7 @@
         </w:rPr>
       </w:pPr>
       <w:r>
-        <w:t xml:space="preserve">To/ إلى من يهمه الأمر</w:t>
+        <w:t xml:space="preserve">To/ Whom it May Concern</w:t>
       </w:r>
     </w:p>
     <w:p>
@@ -129,7 +129,7 @@
               </w:rPr>
             </w:pPr>
             <w:r>
-              <w:t xml:space="preserve">Full Name: دانيا احمد شهاب احمد</w:t>
+              <w:t xml:space="preserve">Full Name: Danya Ahmed Shehab Alalwan</w:t>
             </w:r>
           </w:p>
         </w:tc>
@@ -210,7 +210,7 @@
               </w:rPr>
             </w:pPr>
             <w:r>
-              <w:t xml:space="preserve">Nationality: العراق</w:t>
+              <w:t xml:space="preserve">Nationality: Iraq</w:t>
             </w:r>
           </w:p>
         </w:tc>
@@ -259,7 +259,7 @@
               </w:rPr>
             </w:pPr>
             <w:r>
-              <w:t xml:space="preserve">Department: علوم الحاسوب</w:t>
+              <w:t xml:space="preserve">Department: Computer Science</w:t>
             </w:r>
           </w:p>
         </w:tc>
@@ -342,7 +342,7 @@
               </w:rPr>
             </w:pPr>
             <w:r>
-              <w:t xml:space="preserve">Study: صباحي</w:t>
+              <w:t xml:space="preserve">Study: Morning</w:t>
             </w:r>
           </w:p>
         </w:tc>
@@ -391,7 +391,7 @@
               </w:rPr>
             </w:pPr>
             <w:r>
-              <w:t xml:space="preserve">Semester:الاول</w:t>
+              <w:t xml:space="preserve">Semester:First</w:t>
             </w:r>
           </w:p>
         </w:tc>
@@ -433,7 +433,7 @@
               </w:rPr>
             </w:pPr>
             <w:r>
-              <w:t xml:space="preserve">Grade: متوسط</w:t>
+              <w:t xml:space="preserve">Grade: Medium</w:t>
             </w:r>
           </w:p>
         </w:tc>
@@ -449,16 +449,18 @@
           <w:p>
             <w:pPr>
               <w:bidi w:val="0"/>
-              <w:spacing w:line="240" w:lineRule="auto"/>
-              <w:rPr>
-                <w:rFonts w:cs="PT Bold Heading"/>
-                <w:sz w:val="20"/>
-                <w:szCs w:val="20"/>
-                <w:lang w:bidi="ar-IQ"/>
-              </w:rPr>
             </w:pPr>
             <w:r>
+              <w:t xml:space="preserve"/>
+            </w:r>
+            <w:r>
               <w:t xml:space="preserve">Sequence_of_Graduation: 55</w:t>
+            </w:r>
+            <w:r>
+              <w:t xml:space="preserve"> </w:t>
+            </w:r>
+            <w:r>
+              <w:t xml:space="preserve"/>
             </w:r>
           </w:p>
         </w:tc>
@@ -490,15 +492,6 @@
           <w:p>
             <w:pPr>
               <w:bidi w:val="0"/>
-              <w:spacing w:line="240" w:lineRule="auto"/>
-              <w:rPr>
-                <w:rFonts w:cs="PT Bold Heading"/>
-                <w:b/>
-                <w:bCs/>
-                <w:sz w:val="20"/>
-                <w:szCs w:val="20"/>
-                <w:lang w:bidi="ar-IQ"/>
-              </w:rPr>
             </w:pPr>
             <w:r>
               <w:t xml:space="preserve">Average_of_First_Student: 86</w:t>
@@ -534,35 +527,17 @@
         </w:rPr>
       </w:pPr>
       <w:r>
-        <w:t xml:space="preserve">Bellow is the official transcript of the subjects and marks achieved during the years of study. </w:t>
+        <w:t xml:space="preserve">Below is the official transcript of the subjects and marks achieved during the years of study. </w:t>
       </w:r>
     </w:p>
     <w:p>
       <w:pPr>
         <w:bidi w:val="0"/>
         <w:spacing w:line="240" w:lineRule="auto"/>
-        <w:rPr>
-          <w:rFonts w:cs="PT Bold Heading"/>
-          <w:sz w:val="20"/>
-          <w:szCs w:val="20"/>
-          <w:lang w:bidi="ar-IQ"/>
-        </w:rPr>
       </w:pPr>
       <w:r>
         <w:t xml:space="preserve"/>
       </w:r>
-    </w:p>
-    <w:p>
-      <w:pPr>
-        <w:bidi w:val="0"/>
-        <w:spacing w:line="240" w:lineRule="auto"/>
-        <w:rPr>
-          <w:rFonts w:cs="PT Bold Heading"/>
-          <w:sz w:val="20"/>
-          <w:szCs w:val="20"/>
-          <w:lang w:bidi="ar-IQ"/>
-        </w:rPr>
-      </w:pPr>
     </w:p>
     <w:p>
       <w:pPr>
@@ -675,7 +650,7 @@
               <w:jc w:val="center"/>
             </w:pPr>
             <w:r>
-              <w:t xml:space="preserve">الأستاذ الدكتور هشام كاظم هاشم</w:t>
+              <w:t xml:space="preserve">Prof. Dr. Husham K. Hashim</w:t>
             </w:r>
           </w:p>
           <w:p>
@@ -684,7 +659,7 @@
               <w:jc w:val="center"/>
             </w:pPr>
             <w:r>
-              <w:t xml:space="preserve">العميد</w:t>
+              <w:t xml:space="preserve">The Dean</w:t>
             </w:r>
           </w:p>
         </w:tc>
@@ -718,7 +693,7 @@
               <w:jc w:val="center"/>
             </w:pPr>
             <w:r>
-              <w:t xml:space="preserve">الأستاذ الدكتور رائدة سالم خضير</w:t>
+              <w:t xml:space="preserve">Prof. Dr. Raidah S. Khudhair</w:t>
             </w:r>
           </w:p>
           <w:p>
@@ -727,7 +702,7 @@
               <w:jc w:val="center"/>
             </w:pPr>
             <w:r>
-              <w:t xml:space="preserve">معاون العميد للشوون العلمية والدراسات العليا</w:t>
+              <w:t xml:space="preserve">Dean Assistant for Scientific Affairs and Postgraduate Studies</w:t>
             </w:r>
           </w:p>
         </w:tc>
@@ -748,7 +723,7 @@
               <w:jc w:val="center"/>
             </w:pPr>
             <w:r>
-              <w:t xml:space="preserve"> أسراء فاضل عبد</w:t>
+              <w:t xml:space="preserve"> Israa F. Abed</w:t>
             </w:r>
           </w:p>
           <w:p>
@@ -757,7 +732,7 @@
               <w:jc w:val="center"/>
             </w:pPr>
             <w:r>
-              <w:t xml:space="preserve">مسؤول وحدة الوثائق</w:t>
+              <w:t xml:space="preserve">Graduate Officer</w:t>
             </w:r>
           </w:p>
         </w:tc>
@@ -817,7 +792,7 @@
               <w:jc w:val="center"/>
             </w:pPr>
             <w:r>
-              <w:t xml:space="preserve">الأستاذ المساعد حيدر خزعل محبس</w:t>
+              <w:t xml:space="preserve">Asst. Prof. Dr. Haider K. Mehbes</w:t>
             </w:r>
           </w:p>
           <w:p>
@@ -826,7 +801,7 @@
               <w:jc w:val="center"/>
             </w:pPr>
             <w:r>
-              <w:t xml:space="preserve">مساعد رئيس الجامعة للشؤون العلمية</w:t>
+              <w:t xml:space="preserve">Vice Chancellor for Scientific Affairs</w:t>
             </w:r>
           </w:p>
         </w:tc>
@@ -845,90 +820,20 @@
     <w:p>
       <w:pPr>
         <w:bidi w:val="0"/>
-        <w:rPr>
-          <w:sz w:val="24"/>
-          <w:szCs w:val="24"/>
-          <w:rtl/>
-          <w:lang w:bidi="ar-IQ"/>
-        </w:rPr>
-      </w:pPr>
-    </w:p>
-    <w:p>
-      <w:pPr>
-        <w:bidi w:val="0"/>
-        <w:rPr>
-          <w:sz w:val="24"/>
-          <w:szCs w:val="24"/>
-          <w:lang w:bidi="ar-IQ"/>
-        </w:rPr>
-      </w:pPr>
-      <w:r>
-        <w:br/>
-      </w:r>
-    </w:p>
-    <w:p>
-      <w:pPr>
-        <w:bidi w:val="0"/>
         <w:spacing w:after="0" w:line="240" w:lineRule="auto"/>
-        <w:rPr>
-          <w:sz w:val="24"/>
-          <w:szCs w:val="24"/>
-          <w:lang w:bidi="ar-IQ"/>
-        </w:rPr>
-      </w:pPr>
-    </w:p>
-    <w:p>
-      <w:pPr>
-        <w:bidi w:val="0"/>
-        <w:rPr>
-          <w:sz w:val="24"/>
-          <w:szCs w:val="24"/>
-          <w:rtl/>
-          <w:lang w:bidi="ar-IQ"/>
-        </w:rPr>
-      </w:pPr>
-    </w:p>
-    <w:p>
-      <w:pPr>
-        <w:bidi w:val="0"/>
-        <w:rPr>
-          <w:sz w:val="24"/>
-          <w:szCs w:val="24"/>
-          <w:rtl/>
-          <w:lang w:bidi="ar-IQ"/>
-        </w:rPr>
-      </w:pPr>
-    </w:p>
-    <w:p>
-      <w:pPr>
-        <w:bidi w:val="0"/>
-        <w:rPr>
-          <w:sz w:val="24"/>
-          <w:szCs w:val="24"/>
-          <w:rtl/>
-          <w:lang w:bidi="ar-IQ"/>
-        </w:rPr>
-      </w:pPr>
-    </w:p>
-    <w:p>
-      <w:pPr>
-        <w:bidi w:val="0"/>
-        <w:rPr>
-          <w:sz w:val="24"/>
-          <w:szCs w:val="24"/>
-          <w:rtl/>
-          <w:lang w:bidi="ar-IQ"/>
-        </w:rPr>
-      </w:pPr>
-    </w:p>
-    <w:p>
-      <w:pPr>
-        <w:bidi w:val="0"/>
-        <w:spacing w:after="0" w:line="240" w:lineRule="auto"/>
-      </w:pPr>
-      <w:r>
-        <w:br w:type="page"/>
-      </w:r>
+        <w:sectPr>
+          <w:headerReference w:type="even" r:id="rId8"/>
+          <w:headerReference w:type="default" r:id="rId9"/>
+          <w:footerReference w:type="default" r:id="rId10"/>
+          <w:headerReference w:type="first" r:id="rId11"/>
+          <w:pgSz w:w="11906" w:h="16838"/>
+          <w:pgMar w:top="720" w:right="720" w:bottom="284" w:left="720" w:header="283" w:footer="292" w:gutter="0"/>
+          <w:cols w:space="708"/>
+          <w:bidi/>
+          <w:rtlGutter/>
+          <w:docGrid w:linePitch="360"/>
+        </w:sectPr>
+      </w:pPr>
     </w:p>
     <w:p>
       <w:pPr>
@@ -993,9 +898,6 @@
             <w:r>
               <w:t xml:space="preserve"> </w:t>
             </w:r>
-            <w:r>
-              <w:t xml:space="preserve"/>
-            </w:r>
           </w:p>
           <w:p>
             <w:pPr>
@@ -1018,10 +920,7 @@
               <w:jc w:val="center"/>
             </w:pPr>
             <w:r>
-              <w:t xml:space="preserve"> </w:t>
-            </w:r>
-            <w:r>
-              <w:t xml:space="preserve">نغم باسل محمود</w:t>
+              <w:t xml:space="preserve"> Nagham B. Mahmood</w:t>
             </w:r>
           </w:p>
           <w:p>
@@ -1030,7 +929,7 @@
               <w:jc w:val="center"/>
             </w:pPr>
             <w:r>
-              <w:t xml:space="preserve">منظم الوثيقة</w:t>
+              <w:t xml:space="preserve">Certificate Arrangement</w:t>
             </w:r>
           </w:p>
         </w:tc>
@@ -1197,14 +1096,20 @@
     <w:p>
       <w:pPr>
         <w:pStyle w:val="ListParagraph"/>
+        <w:numPr>
+          <w:ilvl w:val="0"/>
+          <w:numId w:val="29"/>
+        </w:numPr>
         <w:bidi w:val="0"/>
-        <w:ind w:left="360"/>
         <w:rPr>
           <w:sz w:val="24"/>
           <w:szCs w:val="24"/>
           <w:lang w:bidi="ar-IQ"/>
         </w:rPr>
       </w:pPr>
+      <w:r>
+        <w:t>The Medium Of Instruction During The Entire Was English.</w:t>
+      </w:r>
     </w:p>
     <w:p>
       <w:pPr>
@@ -1222,62 +1127,6 @@
         </w:rPr>
       </w:pPr>
       <w:r>
-        <w:t xml:space="preserve">Postponement_and_Failure_Years : (EX: Nill) .</w:t>
-      </w:r>
-    </w:p>
-    <w:p>
-      <w:pPr>
-        <w:pStyle w:val="ListParagraph"/>
-        <w:numPr>
-          <w:ilvl w:val="0"/>
-          <w:numId w:val="29"/>
-        </w:numPr>
-        <w:bidi w:val="0"/>
-        <w:rPr>
-          <w:sz w:val="24"/>
-          <w:szCs w:val="24"/>
-          <w:rtl/>
-          <w:lang w:bidi="ar-IQ"/>
-        </w:rPr>
-      </w:pPr>
-      <w:r>
-        <w:t xml:space="preserve">Subjects_Passed_with_Second_Trial :  (EX: Nill) .</w:t>
-      </w:r>
-    </w:p>
-    <w:p>
-      <w:pPr>
-        <w:pStyle w:val="ListParagraph"/>
-        <w:numPr>
-          <w:ilvl w:val="0"/>
-          <w:numId w:val="29"/>
-        </w:numPr>
-        <w:bidi w:val="0"/>
-        <w:rPr>
-          <w:sz w:val="24"/>
-          <w:szCs w:val="24"/>
-          <w:lang w:bidi="ar-IQ"/>
-        </w:rPr>
-      </w:pPr>
-      <w:r>
-        <w:t>The Medium Of Instruction During The Entire Was English.</w:t>
-      </w:r>
-    </w:p>
-    <w:p>
-      <w:pPr>
-        <w:pStyle w:val="ListParagraph"/>
-        <w:numPr>
-          <w:ilvl w:val="0"/>
-          <w:numId w:val="29"/>
-        </w:numPr>
-        <w:bidi w:val="0"/>
-        <w:rPr>
-          <w:sz w:val="24"/>
-          <w:szCs w:val="24"/>
-          <w:rtl/>
-          <w:lang w:bidi="ar-IQ"/>
-        </w:rPr>
-      </w:pPr>
-      <w:r>
         <w:t>The Certificate is Free From Scratches and Corrections.</w:t>
       </w:r>
     </w:p>
@@ -1294,12 +1143,9 @@
       </w:pPr>
     </w:p>
     <w:sectPr>
-      <w:headerReference w:type="even" r:id="rId8"/>
-      <w:headerReference w:type="default" r:id="rId9"/>
-      <w:footerReference w:type="default" r:id="rId10"/>
-      <w:headerReference w:type="first" r:id="rId11"/>
+      <w:footerReference w:type="default" r:id="rId12"/>
       <w:pgSz w:w="11906" w:h="16838"/>
-      <w:pgMar w:top="720" w:right="720" w:bottom="720" w:left="720" w:header="283" w:footer="1417" w:gutter="0"/>
+      <w:pgMar w:top="720" w:right="720" w:bottom="284" w:left="720" w:header="283" w:footer="292" w:gutter="0"/>
       <w:cols w:space="708"/>
       <w:bidi/>
       <w:rtlGutter/>
@@ -1336,6 +1182,143 @@
 
 <file path=word/footer1.xml><?xml version="1.0" encoding="utf-8"?>
 <w:ftr xmlns:wpc="http://schemas.microsoft.com/office/word/2010/wordprocessingCanvas" xmlns:cx="http://schemas.microsoft.com/office/drawing/2014/chartex" xmlns:cx1="http://schemas.microsoft.com/office/drawing/2015/9/8/chartex" xmlns:cx2="http://schemas.microsoft.com/office/drawing/2015/10/21/chartex" xmlns:cx3="http://schemas.microsoft.com/office/drawing/2016/5/9/chartex" xmlns:cx4="http://schemas.microsoft.com/office/drawing/2016/5/10/chartex" xmlns:cx5="http://schemas.microsoft.com/office/drawing/2016/5/11/chartex" xmlns:cx6="http://schemas.microsoft.com/office/drawing/2016/5/12/chartex" xmlns:cx7="http://schemas.microsoft.com/office/drawing/2016/5/13/chartex" xmlns:cx8="http://schemas.microsoft.com/office/drawing/2016/5/14/chartex" xmlns:mc="http://schemas.openxmlformats.org/markup-compatibility/2006" xmlns:aink="http://schemas.microsoft.com/office/drawing/2016/ink" xmlns:am3d="http://schemas.microsoft.com/office/drawing/2017/model3d" xmlns:o="urn:schemas-microsoft-com:office:office" xmlns:oel="http://schemas.microsoft.com/office/2019/extlst" xmlns:r="http://schemas.openxmlformats.org/officeDocument/2006/relationships" xmlns:m="http://schemas.openxmlformats.org/officeDocument/2006/math" xmlns:v="urn:schemas-microsoft-com:vml" xmlns:wp14="http://schemas.microsoft.com/office/word/2010/wordprocessingDrawing" xmlns:wp="http://schemas.openxmlformats.org/drawingml/2006/wordprocessingDrawing" xmlns:w10="urn:schemas-microsoft-com:office:word" xmlns:w="http://schemas.openxmlformats.org/wordprocessingml/2006/main" xmlns:w14="http://schemas.microsoft.com/office/word/2010/wordml" xmlns:w15="http://schemas.microsoft.com/office/word/2012/wordml" xmlns:w16cex="http://schemas.microsoft.com/office/word/2018/wordml/cex" xmlns:w16cid="http://schemas.microsoft.com/office/word/2016/wordml/cid" xmlns:w16="http://schemas.microsoft.com/office/word/2018/wordml" xmlns:w16du="http://schemas.microsoft.com/office/word/2023/wordml/word16du" xmlns:w16sdtdh="http://schemas.microsoft.com/office/word/2020/wordml/sdtdatahash" xmlns:w16sdtfl="http://schemas.microsoft.com/office/word/2024/wordml/sdtformatlock" xmlns:w16se="http://schemas.microsoft.com/office/word/2015/wordml/symex" xmlns:wpg="http://schemas.microsoft.com/office/word/2010/wordprocessingGroup" xmlns:wpi="http://schemas.microsoft.com/office/word/2010/wordprocessingInk" xmlns:wne="http://schemas.microsoft.com/office/word/2006/wordml" xmlns:wps="http://schemas.microsoft.com/office/word/2010/wordprocessingShape" mc:Ignorable="w14 w15 w16se w16cid w16 w16cex w16sdtdh w16sdtfl w16du wp14">
+  <w:p>
+    <w:pPr>
+      <w:pStyle w:val="Footer"/>
+      <w:bidi w:val="0"/>
+      <w:jc w:val="center"/>
+      <w:rPr>
+        <w:lang w:bidi="ar-IQ"/>
+      </w:rPr>
+    </w:pPr>
+    <w:r>
+      <w:rPr>
+        <w:rtl/>
+        <w:lang w:bidi="ar-IQ"/>
+      </w:rPr>
+      <w:fldChar w:fldCharType="begin"/>
+    </w:r>
+    <w:r>
+      <w:rPr>
+        <w:lang w:bidi="ar-IQ"/>
+      </w:rPr>
+      <w:instrText xml:space="preserve"> </w:instrText>
+    </w:r>
+    <w:r>
+      <w:rPr>
+        <w:lang w:bidi="ar-IQ"/>
+      </w:rPr>
+      <w:instrText>NUMPAGES</w:instrText>
+    </w:r>
+    <w:r>
+      <w:rPr>
+        <w:lang w:bidi="ar-IQ"/>
+      </w:rPr>
+      <w:instrText xml:space="preserve"> </w:instrText>
+    </w:r>
+    <w:r>
+      <w:rPr>
+        <w:rtl/>
+        <w:lang w:bidi="ar-IQ"/>
+      </w:rPr>
+      <w:fldChar w:fldCharType="separate"/>
+    </w:r>
+    <w:r>
+      <w:rPr>
+        <w:noProof/>
+        <w:lang w:bidi="ar-IQ"/>
+      </w:rPr>
+      <w:t>3</w:t>
+    </w:r>
+    <w:r>
+      <w:rPr>
+        <w:rtl/>
+        <w:lang w:bidi="ar-IQ"/>
+      </w:rPr>
+      <w:fldChar w:fldCharType="end"/>
+    </w:r>
+    <w:r>
+      <w:rPr>
+        <w:lang w:bidi="ar-IQ"/>
+      </w:rPr>
+      <w:t xml:space="preserve"> - </w:t>
+    </w:r>
+    <w:r>
+      <w:rPr>
+        <w:lang w:bidi="ar-IQ"/>
+      </w:rPr>
+      <w:fldChar w:fldCharType="begin"/>
+    </w:r>
+    <w:r>
+      <w:rPr>
+        <w:lang w:bidi="ar-IQ"/>
+      </w:rPr>
+      <w:instrText xml:space="preserve"> </w:instrText>
+    </w:r>
+    <w:r>
+      <w:rPr>
+        <w:lang w:bidi="ar-IQ"/>
+      </w:rPr>
+      <w:instrText>PAGE</w:instrText>
+    </w:r>
+    <w:r>
+      <w:rPr>
+        <w:lang w:bidi="ar-IQ"/>
+      </w:rPr>
+      <w:instrText xml:space="preserve"> </w:instrText>
+    </w:r>
+    <w:r>
+      <w:rPr>
+        <w:lang w:bidi="ar-IQ"/>
+      </w:rPr>
+      <w:fldChar w:fldCharType="separate"/>
+    </w:r>
+    <w:r>
+      <w:rPr>
+        <w:noProof/>
+        <w:lang w:bidi="ar-IQ"/>
+      </w:rPr>
+      <w:t>1</w:t>
+    </w:r>
+    <w:r>
+      <w:rPr>
+        <w:lang w:bidi="ar-IQ"/>
+      </w:rPr>
+      <w:fldChar w:fldCharType="end"/>
+    </w:r>
+  </w:p>
+  <w:p>
+    <w:pPr>
+      <w:pStyle w:val="Footer"/>
+      <w:jc w:val="center"/>
+      <w:rPr>
+        <w:lang w:bidi="ar-IQ"/>
+      </w:rPr>
+    </w:pPr>
+  </w:p>
+  <w:p>
+    <w:pPr>
+      <w:pStyle w:val="Footer"/>
+      <w:jc w:val="center"/>
+      <w:rPr>
+        <w:lang w:bidi="ar-IQ"/>
+      </w:rPr>
+    </w:pPr>
+  </w:p>
+</w:ftr>
+</file>
+
+<file path=word/footer2.xml><?xml version="1.0" encoding="utf-8"?>
+<w:ftr xmlns:wpc="http://schemas.microsoft.com/office/word/2010/wordprocessingCanvas" xmlns:cx="http://schemas.microsoft.com/office/drawing/2014/chartex" xmlns:cx1="http://schemas.microsoft.com/office/drawing/2015/9/8/chartex" xmlns:cx2="http://schemas.microsoft.com/office/drawing/2015/10/21/chartex" xmlns:cx3="http://schemas.microsoft.com/office/drawing/2016/5/9/chartex" xmlns:cx4="http://schemas.microsoft.com/office/drawing/2016/5/10/chartex" xmlns:cx5="http://schemas.microsoft.com/office/drawing/2016/5/11/chartex" xmlns:cx6="http://schemas.microsoft.com/office/drawing/2016/5/12/chartex" xmlns:cx7="http://schemas.microsoft.com/office/drawing/2016/5/13/chartex" xmlns:cx8="http://schemas.microsoft.com/office/drawing/2016/5/14/chartex" xmlns:mc="http://schemas.openxmlformats.org/markup-compatibility/2006" xmlns:aink="http://schemas.microsoft.com/office/drawing/2016/ink" xmlns:am3d="http://schemas.microsoft.com/office/drawing/2017/model3d" xmlns:o="urn:schemas-microsoft-com:office:office" xmlns:oel="http://schemas.microsoft.com/office/2019/extlst" xmlns:r="http://schemas.openxmlformats.org/officeDocument/2006/relationships" xmlns:m="http://schemas.openxmlformats.org/officeDocument/2006/math" xmlns:v="urn:schemas-microsoft-com:vml" xmlns:wp14="http://schemas.microsoft.com/office/word/2010/wordprocessingDrawing" xmlns:wp="http://schemas.openxmlformats.org/drawingml/2006/wordprocessingDrawing" xmlns:w10="urn:schemas-microsoft-com:office:word" xmlns:w="http://schemas.openxmlformats.org/wordprocessingml/2006/main" xmlns:w14="http://schemas.microsoft.com/office/word/2010/wordml" xmlns:w15="http://schemas.microsoft.com/office/word/2012/wordml" xmlns:w16cex="http://schemas.microsoft.com/office/word/2018/wordml/cex" xmlns:w16cid="http://schemas.microsoft.com/office/word/2016/wordml/cid" xmlns:w16="http://schemas.microsoft.com/office/word/2018/wordml" xmlns:w16du="http://schemas.microsoft.com/office/word/2023/wordml/word16du" xmlns:w16sdtdh="http://schemas.microsoft.com/office/word/2020/wordml/sdtdatahash" xmlns:w16sdtfl="http://schemas.microsoft.com/office/word/2024/wordml/sdtformatlock" xmlns:w16se="http://schemas.microsoft.com/office/word/2015/wordml/symex" xmlns:wpg="http://schemas.microsoft.com/office/word/2010/wordprocessingGroup" xmlns:wpi="http://schemas.microsoft.com/office/word/2010/wordprocessingInk" xmlns:wne="http://schemas.microsoft.com/office/word/2006/wordml" xmlns:wps="http://schemas.microsoft.com/office/word/2010/wordprocessingShape" mc:Ignorable="w14 w15 w16se w16cid w16 w16cex w16sdtdh w16sdtfl w16du wp14">
+  <w:p>
+    <w:pPr>
+      <w:pStyle w:val="Footer"/>
+      <w:jc w:val="center"/>
+      <w:rPr>
+        <w:lang w:bidi="ar-IQ"/>
+      </w:rPr>
+    </w:pPr>
+  </w:p>
   <w:p>
     <w:pPr>
       <w:pStyle w:val="Footer"/>
@@ -4874,7 +4857,7 @@
   <w:style w:type="paragraph" w:default="1" w:styleId="Normal">
     <w:name w:val="Normal"/>
     <w:qFormat/>
-    <w:rsid w:val="00D411BB"/>
+    <w:rsid w:val="00B25239"/>
     <w:pPr>
       <w:bidi/>
       <w:spacing w:after="200" w:line="276" w:lineRule="auto"/>

</xml_diff>

<commit_message>
new file:   certificates/Danya Ahmed Shehab Alalwan.docx 	modified:   data/queries.py 	modified:   screens/certificate_screen.py 	modified:   screens/personal_screen.py 	modified:   screens/students_screen.py 	modified:   temp_certificate.docx 	modified:   templets/semester - Temp - En - D - SBS.docx 	modified:   ui/side_panel.py
</commit_message>
<xml_diff>
--- a/temp_certificate.docx
+++ b/temp_certificate.docx
@@ -4,39 +4,7 @@
   <w:body>
     <w:p>
       <w:pPr>
-        <w:tabs>
-          <w:tab w:val="right" w:pos="9540"/>
-        </w:tabs>
-        <w:bidi w:val="0"/>
-        <w:rPr>
-          <w:b/>
-          <w:bCs/>
-          <w:sz w:val="24"/>
-          <w:szCs w:val="24"/>
-          <w:u w:val="single"/>
-          <w:rtl/>
-          <w:lang w:bidi="ar-IQ"/>
-        </w:rPr>
-      </w:pPr>
-      <w:bookmarkStart w:id="0" w:name="a1"/>
-      <w:bookmarkEnd w:id="0"/>
-    </w:p>
-    <w:p>
-      <w:pPr>
-        <w:bidi w:val="0"/>
-        <w:rPr>
-          <w:b/>
-          <w:bCs/>
-          <w:sz w:val="24"/>
-          <w:szCs w:val="24"/>
-          <w:u w:val="single"/>
-          <w:rtl/>
-          <w:lang w:bidi="ar-IQ"/>
-        </w:rPr>
-      </w:pPr>
-    </w:p>
-    <w:p>
-      <w:pPr>
+        <w:keepNext/>
         <w:bidi w:val="0"/>
         <w:jc w:val="center"/>
         <w:rPr>
@@ -50,11 +18,90 @@
         </w:rPr>
       </w:pPr>
       <w:r>
+        <w:rPr>
+          <w:noProof/>
+        </w:rPr>
+        <mc:AlternateContent>
+          <mc:Choice Requires="wps">
+            <w:drawing>
+              <wp:anchor distT="0" distB="0" distL="114300" distR="114300" simplePos="0" relativeHeight="251659264" behindDoc="0" locked="0" layoutInCell="1" allowOverlap="1" wp14:anchorId="6AB004C9" wp14:editId="6054E618">
+                <wp:simplePos x="0" y="0"/>
+                <wp:positionH relativeFrom="column">
+                  <wp:posOffset>371475</wp:posOffset>
+                </wp:positionH>
+                <wp:positionV relativeFrom="paragraph">
+                  <wp:posOffset>-708660</wp:posOffset>
+                </wp:positionV>
+                <wp:extent cx="1076325" cy="1228725"/>
+                <wp:effectExtent l="0" t="0" r="28575" b="28575"/>
+                <wp:wrapNone/>
+                <wp:docPr id="1001" name="Rectangle 1"/>
+                <wp:cNvGraphicFramePr/>
+                <a:graphic xmlns:a="http://schemas.openxmlformats.org/drawingml/2006/main">
+                  <a:graphicData uri="http://schemas.microsoft.com/office/word/2010/wordprocessingShape">
+                    <wps:wsp>
+                      <wps:cNvSpPr/>
+                      <wps:spPr>
+                        <a:xfrm>
+                          <a:off x="0" y="0"/>
+                          <a:ext cx="1076325" cy="1228725"/>
+                        </a:xfrm>
+                        <a:prstGeom prst="rect">
+                          <a:avLst/>
+                        </a:prstGeom>
+                        <a:noFill/>
+                        <a:ln w="9525" cap="flat" cmpd="sng" algn="ctr">
+                          <a:solidFill>
+                            <a:schemeClr val="dk1"/>
+                          </a:solidFill>
+                          <a:prstDash val="solid"/>
+                          <a:round/>
+                          <a:headEnd type="none" w="med" len="med"/>
+                          <a:tailEnd type="none" w="med" len="med"/>
+                        </a:ln>
+                      </wps:spPr>
+                      <wps:style>
+                        <a:lnRef idx="0">
+                          <a:scrgbClr r="0" g="0" b="0"/>
+                        </a:lnRef>
+                        <a:fillRef idx="0">
+                          <a:scrgbClr r="0" g="0" b="0"/>
+                        </a:fillRef>
+                        <a:effectRef idx="0">
+                          <a:scrgbClr r="0" g="0" b="0"/>
+                        </a:effectRef>
+                        <a:fontRef idx="minor">
+                          <a:schemeClr val="dk1"/>
+                        </a:fontRef>
+                      </wps:style>
+                      <wps:bodyPr rot="0" spcFirstLastPara="0" vertOverflow="overflow" horzOverflow="overflow" vert="horz" wrap="square" lIns="91440" tIns="45720" rIns="91440" bIns="45720" numCol="1" spcCol="0" rtlCol="0" fromWordArt="0" anchor="ctr" anchorCtr="0" forceAA="0" compatLnSpc="1">
+                        <a:prstTxWarp prst="textNoShape">
+                          <a:avLst/>
+                        </a:prstTxWarp>
+                        <a:noAutofit/>
+                      </wps:bodyPr>
+                    </wps:wsp>
+                  </a:graphicData>
+                </a:graphic>
+              </wp:anchor>
+            </w:drawing>
+          </mc:Choice>
+          <mc:Fallback>
+            <w:pict>
+              <v:rect w14:anchorId="3D089C76" id="Rectangle 1" o:spid="_x0000_s1026" style="position:absolute;margin-left:29.25pt;margin-top:-55.8pt;width:84.75pt;height:96.75pt;z-index:251659264;visibility:visible;mso-wrap-style:square;mso-wrap-distance-left:9pt;mso-wrap-distance-top:0;mso-wrap-distance-right:9pt;mso-wrap-distance-bottom:0;mso-position-horizontal:absolute;mso-position-horizontal-relative:text;mso-position-vertical:absolute;mso-position-vertical-relative:text;v-text-anchor:middle" o:gfxdata="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" filled="f" strokecolor="black [3200]">
+                <v:stroke joinstyle="round"/>
+              </v:rect>
+            </w:pict>
+          </mc:Fallback>
+        </mc:AlternateContent>
+      </w:r>
+      <w:r>
         <w:t>Transcript Certification of Graduation</w:t>
       </w:r>
     </w:p>
     <w:p>
       <w:pPr>
+        <w:keepNext/>
         <w:bidi w:val="0"/>
         <w:jc w:val="center"/>
         <w:rPr>
@@ -64,28 +111,11 @@
           <w:sz w:val="20"/>
           <w:szCs w:val="20"/>
           <w:u w:val="single"/>
-          <w:rtl/>
           <w:lang w:bidi="ar-IQ"/>
         </w:rPr>
       </w:pPr>
       <w:r>
         <w:t xml:space="preserve">To/ Whom it May Concern</w:t>
-      </w:r>
-    </w:p>
-    <w:p>
-      <w:pPr>
-        <w:bidi w:val="0"/>
-        <w:rPr>
-          <w:b/>
-          <w:bCs/>
-          <w:sz w:val="24"/>
-          <w:szCs w:val="24"/>
-          <w:rtl/>
-          <w:lang w:bidi="ar-IQ"/>
-        </w:rPr>
-      </w:pPr>
-      <w:r>
-        <w:t xml:space="preserve">                                            </w:t>
       </w:r>
     </w:p>
     <w:tbl>
@@ -100,13 +130,14 @@
           <w:insideH w:val="none" w:sz="0" w:space="0" w:color="auto"/>
           <w:insideV w:val="none" w:sz="0" w:space="0" w:color="auto"/>
         </w:tblBorders>
+        <w:tblLayout w:type="fixed"/>
         <w:tblLook w:val="04A0" w:firstRow="1" w:lastRow="0" w:firstColumn="1" w:lastColumn="0" w:noHBand="0" w:noVBand="1"/>
       </w:tblPr>
       <w:tblGrid>
-        <w:gridCol w:w="3516"/>
-        <w:gridCol w:w="3381"/>
-        <w:gridCol w:w="1993"/>
-        <w:gridCol w:w="1576"/>
+        <w:gridCol w:w="3517"/>
+        <w:gridCol w:w="3288"/>
+        <w:gridCol w:w="1842"/>
+        <w:gridCol w:w="1819"/>
       </w:tblGrid>
       <w:tr>
         <w:trPr>
@@ -114,11 +145,12 @@
         </w:trPr>
         <w:tc>
           <w:tcPr>
-            <w:tcW w:w="3295" w:type="pct"/>
+            <w:tcW w:w="3251" w:type="pct"/>
             <w:gridSpan w:val="2"/>
           </w:tcPr>
           <w:p>
             <w:pPr>
+              <w:keepNext/>
               <w:bidi w:val="0"/>
               <w:spacing w:line="240" w:lineRule="auto"/>
               <w:rPr>
@@ -135,10 +167,11 @@
         </w:tc>
         <w:tc>
           <w:tcPr>
-            <w:tcW w:w="952" w:type="pct"/>
-          </w:tcPr>
-          <w:p>
-            <w:pPr>
+            <w:tcW w:w="880" w:type="pct"/>
+          </w:tcPr>
+          <w:p>
+            <w:pPr>
+              <w:keepNext/>
               <w:bidi w:val="0"/>
               <w:spacing w:line="240" w:lineRule="auto"/>
               <w:rPr>
@@ -152,10 +185,11 @@
         </w:tc>
         <w:tc>
           <w:tcPr>
-            <w:tcW w:w="753" w:type="pct"/>
-          </w:tcPr>
-          <w:p>
-            <w:pPr>
+            <w:tcW w:w="869" w:type="pct"/>
+          </w:tcPr>
+          <w:p>
+            <w:pPr>
+              <w:keepNext/>
               <w:bidi w:val="0"/>
               <w:spacing w:line="240" w:lineRule="auto"/>
               <w:rPr>
@@ -174,11 +208,12 @@
         </w:trPr>
         <w:tc>
           <w:tcPr>
-            <w:tcW w:w="3295" w:type="pct"/>
+            <w:tcW w:w="3251" w:type="pct"/>
             <w:gridSpan w:val="2"/>
           </w:tcPr>
           <w:p>
             <w:pPr>
+              <w:keepNext/>
               <w:bidi w:val="0"/>
               <w:spacing w:line="240" w:lineRule="auto"/>
               <w:rPr>
@@ -195,11 +230,12 @@
         </w:tc>
         <w:tc>
           <w:tcPr>
-            <w:tcW w:w="1705" w:type="pct"/>
+            <w:tcW w:w="1749" w:type="pct"/>
             <w:gridSpan w:val="2"/>
           </w:tcPr>
           <w:p>
             <w:pPr>
+              <w:keepNext/>
               <w:bidi w:val="0"/>
               <w:spacing w:line="240" w:lineRule="auto"/>
               <w:rPr>
@@ -225,6 +261,7 @@
           </w:tcPr>
           <w:p>
             <w:pPr>
+              <w:keepNext/>
               <w:bidi w:val="0"/>
               <w:spacing w:line="240" w:lineRule="auto"/>
               <w:rPr>
@@ -243,10 +280,11 @@
         </w:tc>
         <w:tc>
           <w:tcPr>
-            <w:tcW w:w="1615" w:type="pct"/>
-          </w:tcPr>
-          <w:p>
-            <w:pPr>
+            <w:tcW w:w="1571" w:type="pct"/>
+          </w:tcPr>
+          <w:p>
+            <w:pPr>
+              <w:keepNext/>
               <w:bidi w:val="0"/>
               <w:spacing w:line="240" w:lineRule="auto"/>
               <w:rPr>
@@ -265,10 +303,11 @@
         </w:tc>
         <w:tc>
           <w:tcPr>
-            <w:tcW w:w="952" w:type="pct"/>
-          </w:tcPr>
-          <w:p>
-            <w:pPr>
+            <w:tcW w:w="880" w:type="pct"/>
+          </w:tcPr>
+          <w:p>
+            <w:pPr>
+              <w:keepNext/>
               <w:bidi w:val="0"/>
               <w:spacing w:line="240" w:lineRule="auto"/>
               <w:rPr>
@@ -282,10 +321,11 @@
         </w:tc>
         <w:tc>
           <w:tcPr>
-            <w:tcW w:w="753" w:type="pct"/>
-          </w:tcPr>
-          <w:p>
-            <w:pPr>
+            <w:tcW w:w="869" w:type="pct"/>
+          </w:tcPr>
+          <w:p>
+            <w:pPr>
+              <w:keepNext/>
               <w:bidi w:val="0"/>
               <w:spacing w:line="240" w:lineRule="auto"/>
               <w:rPr>
@@ -304,11 +344,12 @@
         </w:trPr>
         <w:tc>
           <w:tcPr>
-            <w:tcW w:w="3295" w:type="pct"/>
+            <w:tcW w:w="3251" w:type="pct"/>
             <w:gridSpan w:val="2"/>
           </w:tcPr>
           <w:p>
             <w:pPr>
+              <w:keepNext/>
               <w:bidi w:val="0"/>
               <w:spacing w:line="240" w:lineRule="auto"/>
               <w:rPr>
@@ -327,11 +368,12 @@
         </w:tc>
         <w:tc>
           <w:tcPr>
-            <w:tcW w:w="1705" w:type="pct"/>
+            <w:tcW w:w="1749" w:type="pct"/>
             <w:gridSpan w:val="2"/>
           </w:tcPr>
           <w:p>
             <w:pPr>
+              <w:keepNext/>
               <w:bidi w:val="0"/>
               <w:spacing w:line="240" w:lineRule="auto"/>
               <w:rPr>
@@ -357,6 +399,7 @@
           </w:tcPr>
           <w:p>
             <w:pPr>
+              <w:keepNext/>
               <w:bidi w:val="0"/>
               <w:spacing w:line="240" w:lineRule="auto"/>
               <w:rPr>
@@ -375,10 +418,11 @@
         </w:tc>
         <w:tc>
           <w:tcPr>
-            <w:tcW w:w="1615" w:type="pct"/>
-          </w:tcPr>
-          <w:p>
-            <w:pPr>
+            <w:tcW w:w="1571" w:type="pct"/>
+          </w:tcPr>
+          <w:p>
+            <w:pPr>
+              <w:keepNext/>
               <w:bidi w:val="0"/>
               <w:spacing w:line="240" w:lineRule="auto"/>
               <w:rPr>
@@ -390,6 +434,7 @@
                 <w:lang w:bidi="ar-IQ"/>
               </w:rPr>
             </w:pPr>
+            <w:proofErr w:type="gramStart"/>
             <w:r>
               <w:t xml:space="preserve">Semester:First</w:t>
             </w:r>
@@ -397,10 +442,11 @@
         </w:tc>
         <w:tc>
           <w:tcPr>
-            <w:tcW w:w="952" w:type="pct"/>
-          </w:tcPr>
-          <w:p>
-            <w:pPr>
+            <w:tcW w:w="880" w:type="pct"/>
+          </w:tcPr>
+          <w:p>
+            <w:pPr>
+              <w:keepNext/>
               <w:bidi w:val="0"/>
               <w:spacing w:line="240" w:lineRule="auto"/>
               <w:rPr>
@@ -412,6 +458,7 @@
                 <w:lang w:bidi="ar-IQ"/>
               </w:rPr>
             </w:pPr>
+            <w:proofErr w:type="gramStart"/>
             <w:r>
               <w:t xml:space="preserve">Average:65</w:t>
             </w:r>
@@ -419,10 +466,11 @@
         </w:tc>
         <w:tc>
           <w:tcPr>
-            <w:tcW w:w="753" w:type="pct"/>
-          </w:tcPr>
-          <w:p>
-            <w:pPr>
+            <w:tcW w:w="869" w:type="pct"/>
+          </w:tcPr>
+          <w:p>
+            <w:pPr>
+              <w:keepNext/>
               <w:bidi w:val="0"/>
               <w:spacing w:line="240" w:lineRule="auto"/>
               <w:rPr>
@@ -440,38 +488,39 @@
       </w:tr>
       <w:tr>
         <w:trPr>
-          <w:trHeight w:val="477"/>
+          <w:trHeight w:val="340"/>
         </w:trPr>
         <w:tc>
           <w:tcPr>
             <w:tcW w:w="1680" w:type="pct"/>
-          </w:tcPr>
-          <w:p>
-            <w:pPr>
-              <w:bidi w:val="0"/>
-            </w:pPr>
-            <w:r>
-              <w:t xml:space="preserve"/>
-            </w:r>
-            <w:r>
-              <w:t xml:space="preserve">Sequence_of_Graduation: 55</w:t>
-            </w:r>
-            <w:r>
-              <w:t xml:space="preserve"> </w:t>
-            </w:r>
-            <w:r>
-              <w:t xml:space="preserve"/>
-            </w:r>
-          </w:p>
-        </w:tc>
-        <w:tc>
-          <w:tcPr>
-            <w:tcW w:w="1615" w:type="pct"/>
-          </w:tcPr>
-          <w:p>
-            <w:pPr>
-              <w:bidi w:val="0"/>
-              <w:spacing w:line="240" w:lineRule="auto"/>
+            <w:vAlign w:val="center"/>
+          </w:tcPr>
+          <w:p>
+            <w:pPr>
+              <w:keepNext/>
+              <w:bidi w:val="0"/>
+              <w:spacing w:after="0"/>
+            </w:pPr>
+            <w:proofErr w:type="spellStart"/>
+            <w:r>
+              <w:t>Sequence_of_Graduation</w:t>
+            </w:r>
+            <w:proofErr w:type="spellEnd"/>
+            <w:r>
+              <w:t xml:space="preserve">: 55</w:t>
+            </w:r>
+          </w:p>
+        </w:tc>
+        <w:tc>
+          <w:tcPr>
+            <w:tcW w:w="1571" w:type="pct"/>
+            <w:vAlign w:val="center"/>
+          </w:tcPr>
+          <w:p>
+            <w:pPr>
+              <w:keepNext/>
+              <w:bidi w:val="0"/>
+              <w:spacing w:after="0" w:line="240" w:lineRule="auto"/>
               <w:rPr>
                 <w:rFonts w:cs="PT Bold Heading"/>
                 <w:sz w:val="20"/>
@@ -486,15 +535,23 @@
         </w:tc>
         <w:tc>
           <w:tcPr>
-            <w:tcW w:w="1705" w:type="pct"/>
+            <w:tcW w:w="1749" w:type="pct"/>
             <w:gridSpan w:val="2"/>
-          </w:tcPr>
-          <w:p>
-            <w:pPr>
-              <w:bidi w:val="0"/>
-            </w:pPr>
-            <w:r>
-              <w:t xml:space="preserve">Average_of_First_Student: 86</w:t>
+            <w:vAlign w:val="center"/>
+          </w:tcPr>
+          <w:p>
+            <w:pPr>
+              <w:keepNext/>
+              <w:bidi w:val="0"/>
+              <w:spacing w:after="0"/>
+            </w:pPr>
+            <w:proofErr w:type="spellStart"/>
+            <w:r>
+              <w:t>Average_of_First_Student</w:t>
+            </w:r>
+            <w:proofErr w:type="spellEnd"/>
+            <w:r>
+              <w:t xml:space="preserve">: 86</w:t>
             </w:r>
           </w:p>
         </w:tc>
@@ -502,8 +559,9 @@
     </w:tbl>
     <w:p>
       <w:pPr>
+        <w:keepNext/>
         <w:bidi w:val="0"/>
-        <w:spacing w:line="240" w:lineRule="auto"/>
+        <w:spacing w:after="0" w:line="240" w:lineRule="auto"/>
         <w:rPr>
           <w:rFonts w:cs="PT Bold Heading"/>
           <w:sz w:val="20"/>
@@ -517,8 +575,9 @@
     </w:p>
     <w:p>
       <w:pPr>
+        <w:keepNext/>
         <w:bidi w:val="0"/>
-        <w:spacing w:line="240" w:lineRule="auto"/>
+        <w:spacing w:after="0" w:line="240" w:lineRule="auto"/>
         <w:rPr>
           <w:rFonts w:cs="PT Bold Heading"/>
           <w:sz w:val="20"/>
@@ -527,17 +586,3994 @@
         </w:rPr>
       </w:pPr>
       <w:r>
-        <w:t xml:space="preserve">Below is the official transcript of the subjects and marks achieved during the years of study. </w:t>
+        <w:t xml:space="preserve">Below</w:t>
+      </w:r>
+      <w:r>
+        <w:t xml:space="preserve"> is the official transcript of the subjects and marks achieved during the years of study. </w:t>
       </w:r>
     </w:p>
     <w:p>
       <w:pPr>
+        <w:keepNext/>
+        <w:keepLines/>
         <w:bidi w:val="0"/>
         <w:spacing w:line="240" w:lineRule="auto"/>
       </w:pPr>
       <w:r>
         <w:t xml:space="preserve"/>
       </w:r>
+    </w:p>
+    <w:tbl>
+      <w:tblPr>
+        <w:tblStyle w:val="TableGrid"/>
+        <w:tblW w:w="5000" w:type="pct"/>
+        <w:tblLayout w:type="fixed"/>
+        <w:tblLook w:val="04A0" w:firstRow="1" w:lastRow="0" w:firstColumn="1" w:lastColumn="0" w:noHBand="0" w:noVBand="1"/>
+      </w:tblPr>
+      <w:tblGrid>
+        <w:gridCol w:w="3822"/>
+        <w:gridCol w:w="707"/>
+        <w:gridCol w:w="709"/>
+        <w:gridCol w:w="3829"/>
+        <w:gridCol w:w="709"/>
+        <w:gridCol w:w="680"/>
+      </w:tblGrid>
+      <w:tr>
+        <w:trPr>
+          <w:cantSplit/>
+        </w:trPr>
+        <w:tc>
+          <w:tcPr>
+            <w:tcW w:w="2505" w:type="pct"/>
+            <w:gridSpan w:val="3"/>
+          </w:tcPr>
+          <w:p>
+            <w:pPr>
+              <w:keepNext/>
+              <w:keepLines/>
+              <w:bidi w:val="0"/>
+              <w:spacing w:after="0"/>
+            </w:pPr>
+            <w:r>
+              <w:t xml:space="preserve">Semester 1 - 2015-2016</w:t>
+            </w:r>
+          </w:p>
+        </w:tc>
+        <w:tc>
+          <w:tcPr>
+            <w:tcW w:w="2495" w:type="pct"/>
+            <w:gridSpan w:val="3"/>
+          </w:tcPr>
+          <w:p>
+            <w:pPr>
+              <w:keepNext/>
+              <w:keepLines/>
+              <w:bidi w:val="0"/>
+              <w:spacing w:after="0"/>
+            </w:pPr>
+            <w:r>
+              <w:t xml:space="preserve">Semester 2 - 2015-2016</w:t>
+            </w:r>
+          </w:p>
+        </w:tc>
+      </w:tr>
+      <w:tr>
+        <w:trPr>
+          <w:cantSplit/>
+        </w:trPr>
+        <w:tc>
+          <w:tcPr>
+            <w:tcW w:w="1828" w:type="pct"/>
+          </w:tcPr>
+          <w:p>
+            <w:pPr>
+              <w:keepNext/>
+              <w:keepLines/>
+              <w:bidi w:val="0"/>
+              <w:spacing w:after="0"/>
+            </w:pPr>
+            <w:r>
+              <w:t>Subject</w:t>
+            </w:r>
+          </w:p>
+        </w:tc>
+        <w:tc>
+          <w:tcPr>
+            <w:tcW w:w="338" w:type="pct"/>
+          </w:tcPr>
+          <w:p>
+            <w:pPr>
+              <w:keepNext/>
+              <w:keepLines/>
+              <w:bidi w:val="0"/>
+              <w:spacing w:after="0"/>
+            </w:pPr>
+            <w:r>
+              <w:t>Mark</w:t>
+            </w:r>
+          </w:p>
+        </w:tc>
+        <w:tc>
+          <w:tcPr>
+            <w:tcW w:w="339" w:type="pct"/>
+          </w:tcPr>
+          <w:p>
+            <w:pPr>
+              <w:keepNext/>
+              <w:keepLines/>
+              <w:bidi w:val="0"/>
+              <w:spacing w:after="0"/>
+            </w:pPr>
+            <w:r>
+              <w:t>Unit</w:t>
+            </w:r>
+          </w:p>
+        </w:tc>
+        <w:tc>
+          <w:tcPr>
+            <w:tcW w:w="1831" w:type="pct"/>
+          </w:tcPr>
+          <w:p>
+            <w:pPr>
+              <w:keepNext/>
+              <w:keepLines/>
+              <w:bidi w:val="0"/>
+              <w:spacing w:after="0"/>
+            </w:pPr>
+            <w:r>
+              <w:t>Subject</w:t>
+            </w:r>
+          </w:p>
+        </w:tc>
+        <w:tc>
+          <w:tcPr>
+            <w:tcW w:w="339" w:type="pct"/>
+          </w:tcPr>
+          <w:p>
+            <w:pPr>
+              <w:keepNext/>
+              <w:keepLines/>
+              <w:bidi w:val="0"/>
+              <w:spacing w:after="0"/>
+            </w:pPr>
+            <w:r>
+              <w:t>Mark</w:t>
+            </w:r>
+          </w:p>
+        </w:tc>
+        <w:tc>
+          <w:tcPr>
+            <w:tcW w:w="325" w:type="pct"/>
+          </w:tcPr>
+          <w:p>
+            <w:pPr>
+              <w:keepNext/>
+              <w:keepLines/>
+              <w:bidi w:val="0"/>
+              <w:spacing w:after="0"/>
+            </w:pPr>
+            <w:r>
+              <w:t xml:space="preserve">Unit</w:t>
+            </w:r>
+          </w:p>
+        </w:tc>
+      </w:tr>
+      <w:tr>
+        <w:trPr>
+          <w:cantSplit/>
+        </w:trPr>
+        <w:tc>
+          <w:tcPr>
+            <w:tcW w:w="1828" w:type="pct"/>
+          </w:tcPr>
+          <w:p>
+            <w:pPr>
+              <w:keepNext/>
+              <w:keepLines/>
+              <w:bidi w:val="0"/>
+              <w:spacing w:after="0"/>
+            </w:pPr>
+            <w:r>
+              <w:t xml:space="preserve">First Aid</w:t>
+            </w:r>
+          </w:p>
+        </w:tc>
+        <w:tc>
+          <w:tcPr>
+            <w:tcW w:w="338" w:type="pct"/>
+          </w:tcPr>
+          <w:p>
+            <w:pPr>
+              <w:keepNext/>
+              <w:keepLines/>
+              <w:bidi w:val="0"/>
+              <w:spacing w:after="0"/>
+            </w:pPr>
+            <w:r>
+              <w:t xml:space="preserve">78.0</w:t>
+            </w:r>
+          </w:p>
+        </w:tc>
+        <w:tc>
+          <w:tcPr>
+            <w:tcW w:w="339" w:type="pct"/>
+          </w:tcPr>
+          <w:p>
+            <w:pPr>
+              <w:keepNext/>
+              <w:keepLines/>
+              <w:bidi w:val="0"/>
+              <w:spacing w:after="0"/>
+            </w:pPr>
+            <w:r>
+              <w:t xml:space="preserve">2</w:t>
+            </w:r>
+          </w:p>
+        </w:tc>
+        <w:tc>
+          <w:tcPr>
+            <w:tcW w:w="1831" w:type="pct"/>
+          </w:tcPr>
+          <w:p>
+            <w:pPr>
+              <w:keepNext/>
+              <w:keepLines/>
+              <w:bidi w:val="0"/>
+              <w:spacing w:after="0"/>
+            </w:pPr>
+            <w:r>
+              <w:t xml:space="preserve">Computer Ethics</w:t>
+            </w:r>
+          </w:p>
+        </w:tc>
+        <w:tc>
+          <w:tcPr>
+            <w:tcW w:w="339" w:type="pct"/>
+          </w:tcPr>
+          <w:p>
+            <w:pPr>
+              <w:keepNext/>
+              <w:keepLines/>
+              <w:bidi w:val="0"/>
+              <w:spacing w:after="0"/>
+            </w:pPr>
+            <w:r>
+              <w:t xml:space="preserve">53.0</w:t>
+            </w:r>
+          </w:p>
+        </w:tc>
+        <w:tc>
+          <w:tcPr>
+            <w:tcW w:w="325" w:type="pct"/>
+          </w:tcPr>
+          <w:p>
+            <w:pPr>
+              <w:keepNext/>
+              <w:keepLines/>
+              <w:bidi w:val="0"/>
+              <w:spacing w:after="0"/>
+            </w:pPr>
+            <w:r>
+              <w:t xml:space="preserve">2</w:t>
+            </w:r>
+          </w:p>
+        </w:tc>
+      </w:tr>
+      <w:tr>
+        <w:trPr>
+          <w:cantSplit/>
+        </w:trPr>
+        <w:tc>
+          <w:tcPr>
+            <w:tcW w:w="1828" w:type="pct"/>
+          </w:tcPr>
+          <w:p>
+            <w:pPr>
+              <w:keepNext/>
+              <w:keepLines/>
+              <w:bidi w:val="0"/>
+              <w:spacing w:after="0"/>
+            </w:pPr>
+            <w:r>
+              <w:t xml:space="preserve">Programming I</w:t>
+            </w:r>
+          </w:p>
+        </w:tc>
+        <w:tc>
+          <w:tcPr>
+            <w:tcW w:w="338" w:type="pct"/>
+          </w:tcPr>
+          <w:p>
+            <w:pPr>
+              <w:keepNext/>
+              <w:keepLines/>
+              <w:bidi w:val="0"/>
+              <w:spacing w:after="0"/>
+            </w:pPr>
+            <w:r>
+              <w:t xml:space="preserve">56.0</w:t>
+            </w:r>
+          </w:p>
+        </w:tc>
+        <w:tc>
+          <w:tcPr>
+            <w:tcW w:w="339" w:type="pct"/>
+          </w:tcPr>
+          <w:p>
+            <w:pPr>
+              <w:keepNext/>
+              <w:keepLines/>
+              <w:bidi w:val="0"/>
+              <w:spacing w:after="0"/>
+            </w:pPr>
+            <w:r>
+              <w:t xml:space="preserve">4</w:t>
+            </w:r>
+          </w:p>
+        </w:tc>
+        <w:tc>
+          <w:tcPr>
+            <w:tcW w:w="1831" w:type="pct"/>
+          </w:tcPr>
+          <w:p>
+            <w:pPr>
+              <w:keepNext/>
+              <w:keepLines/>
+              <w:bidi w:val="0"/>
+              <w:spacing w:after="0"/>
+            </w:pPr>
+            <w:r>
+              <w:t xml:space="preserve">Democracy Education</w:t>
+            </w:r>
+          </w:p>
+        </w:tc>
+        <w:tc>
+          <w:tcPr>
+            <w:tcW w:w="339" w:type="pct"/>
+          </w:tcPr>
+          <w:p>
+            <w:pPr>
+              <w:keepNext/>
+              <w:keepLines/>
+              <w:bidi w:val="0"/>
+              <w:spacing w:after="0"/>
+            </w:pPr>
+            <w:r>
+              <w:t xml:space="preserve">83.0</w:t>
+            </w:r>
+          </w:p>
+        </w:tc>
+        <w:tc>
+          <w:tcPr>
+            <w:tcW w:w="325" w:type="pct"/>
+          </w:tcPr>
+          <w:p>
+            <w:pPr>
+              <w:keepNext/>
+              <w:keepLines/>
+              <w:bidi w:val="0"/>
+              <w:spacing w:after="0"/>
+            </w:pPr>
+            <w:r>
+              <w:t xml:space="preserve">1</w:t>
+            </w:r>
+          </w:p>
+        </w:tc>
+      </w:tr>
+      <w:tr>
+        <w:trPr>
+          <w:cantSplit/>
+        </w:trPr>
+        <w:tc>
+          <w:tcPr>
+            <w:tcW w:w="1828" w:type="pct"/>
+          </w:tcPr>
+          <w:p>
+            <w:pPr>
+              <w:keepNext/>
+              <w:keepLines/>
+              <w:bidi w:val="0"/>
+              <w:spacing w:after="0"/>
+            </w:pPr>
+            <w:r>
+              <w:t xml:space="preserve">Logic Design</w:t>
+            </w:r>
+          </w:p>
+        </w:tc>
+        <w:tc>
+          <w:tcPr>
+            <w:tcW w:w="338" w:type="pct"/>
+          </w:tcPr>
+          <w:p>
+            <w:pPr>
+              <w:keepNext/>
+              <w:keepLines/>
+              <w:bidi w:val="0"/>
+              <w:spacing w:after="0"/>
+            </w:pPr>
+            <w:r>
+              <w:t xml:space="preserve">53.0</w:t>
+            </w:r>
+          </w:p>
+        </w:tc>
+        <w:tc>
+          <w:tcPr>
+            <w:tcW w:w="339" w:type="pct"/>
+          </w:tcPr>
+          <w:p>
+            <w:pPr>
+              <w:keepNext/>
+              <w:keepLines/>
+              <w:bidi w:val="0"/>
+              <w:spacing w:after="0"/>
+            </w:pPr>
+            <w:r>
+              <w:t xml:space="preserve">3</w:t>
+            </w:r>
+          </w:p>
+        </w:tc>
+        <w:tc>
+          <w:tcPr>
+            <w:tcW w:w="1831" w:type="pct"/>
+          </w:tcPr>
+          <w:p>
+            <w:pPr>
+              <w:keepNext/>
+              <w:keepLines/>
+              <w:bidi w:val="0"/>
+              <w:spacing w:after="0"/>
+            </w:pPr>
+            <w:r>
+              <w:t xml:space="preserve">English Language I</w:t>
+            </w:r>
+          </w:p>
+        </w:tc>
+        <w:tc>
+          <w:tcPr>
+            <w:tcW w:w="339" w:type="pct"/>
+          </w:tcPr>
+          <w:p>
+            <w:pPr>
+              <w:keepNext/>
+              <w:keepLines/>
+              <w:bidi w:val="0"/>
+              <w:spacing w:after="0"/>
+            </w:pPr>
+            <w:r>
+              <w:t xml:space="preserve">75.0</w:t>
+            </w:r>
+          </w:p>
+        </w:tc>
+        <w:tc>
+          <w:tcPr>
+            <w:tcW w:w="325" w:type="pct"/>
+          </w:tcPr>
+          <w:p>
+            <w:pPr>
+              <w:keepNext/>
+              <w:keepLines/>
+              <w:bidi w:val="0"/>
+              <w:spacing w:after="0"/>
+            </w:pPr>
+            <w:r>
+              <w:t xml:space="preserve">2</w:t>
+            </w:r>
+          </w:p>
+        </w:tc>
+      </w:tr>
+      <w:tr>
+        <w:trPr>
+          <w:cantSplit/>
+        </w:trPr>
+        <w:tc>
+          <w:tcPr>
+            <w:tcW w:w="1828" w:type="pct"/>
+          </w:tcPr>
+          <w:p>
+            <w:pPr>
+              <w:keepNext/>
+              <w:keepLines/>
+              <w:bidi w:val="0"/>
+              <w:spacing w:after="0"/>
+            </w:pPr>
+            <w:r>
+              <w:t xml:space="preserve">Sport</w:t>
+            </w:r>
+          </w:p>
+        </w:tc>
+        <w:tc>
+          <w:tcPr>
+            <w:tcW w:w="338" w:type="pct"/>
+          </w:tcPr>
+          <w:p>
+            <w:pPr>
+              <w:keepNext/>
+              <w:keepLines/>
+              <w:bidi w:val="0"/>
+              <w:spacing w:after="0"/>
+            </w:pPr>
+            <w:r>
+              <w:t xml:space="preserve">71.0</w:t>
+            </w:r>
+          </w:p>
+        </w:tc>
+        <w:tc>
+          <w:tcPr>
+            <w:tcW w:w="339" w:type="pct"/>
+          </w:tcPr>
+          <w:p>
+            <w:pPr>
+              <w:keepNext/>
+              <w:keepLines/>
+              <w:bidi w:val="0"/>
+              <w:spacing w:after="0"/>
+            </w:pPr>
+            <w:r>
+              <w:t xml:space="preserve">1</w:t>
+            </w:r>
+          </w:p>
+        </w:tc>
+        <w:tc>
+          <w:tcPr>
+            <w:tcW w:w="1831" w:type="pct"/>
+          </w:tcPr>
+          <w:p>
+            <w:pPr>
+              <w:keepNext/>
+              <w:keepLines/>
+              <w:bidi w:val="0"/>
+              <w:spacing w:after="0"/>
+            </w:pPr>
+            <w:r>
+              <w:t xml:space="preserve">Discrete Structures</w:t>
+            </w:r>
+          </w:p>
+        </w:tc>
+        <w:tc>
+          <w:tcPr>
+            <w:tcW w:w="339" w:type="pct"/>
+          </w:tcPr>
+          <w:p>
+            <w:pPr>
+              <w:keepNext/>
+              <w:keepLines/>
+              <w:bidi w:val="0"/>
+              <w:spacing w:after="0"/>
+            </w:pPr>
+            <w:r>
+              <w:t xml:space="preserve">50.0</w:t>
+            </w:r>
+          </w:p>
+        </w:tc>
+        <w:tc>
+          <w:tcPr>
+            <w:tcW w:w="325" w:type="pct"/>
+          </w:tcPr>
+          <w:p>
+            <w:pPr>
+              <w:keepNext/>
+              <w:keepLines/>
+              <w:bidi w:val="0"/>
+              <w:spacing w:after="0"/>
+            </w:pPr>
+            <w:r>
+              <w:t xml:space="preserve">3</w:t>
+            </w:r>
+          </w:p>
+        </w:tc>
+      </w:tr>
+      <w:tr>
+        <w:trPr>
+          <w:cantSplit/>
+        </w:trPr>
+        <w:tc>
+          <w:tcPr>
+            <w:tcW w:w="1828" w:type="pct"/>
+          </w:tcPr>
+          <w:p>
+            <w:pPr>
+              <w:keepNext/>
+              <w:keepLines/>
+              <w:bidi w:val="0"/>
+              <w:spacing w:after="0"/>
+            </w:pPr>
+            <w:r>
+              <w:t xml:space="preserve">Mathematics for Computing</w:t>
+            </w:r>
+          </w:p>
+        </w:tc>
+        <w:tc>
+          <w:tcPr>
+            <w:tcW w:w="338" w:type="pct"/>
+          </w:tcPr>
+          <w:p>
+            <w:pPr>
+              <w:keepNext/>
+              <w:keepLines/>
+              <w:bidi w:val="0"/>
+              <w:spacing w:after="0"/>
+            </w:pPr>
+            <w:r>
+              <w:t xml:space="preserve">60.0</w:t>
+            </w:r>
+          </w:p>
+        </w:tc>
+        <w:tc>
+          <w:tcPr>
+            <w:tcW w:w="339" w:type="pct"/>
+          </w:tcPr>
+          <w:p>
+            <w:pPr>
+              <w:keepNext/>
+              <w:keepLines/>
+              <w:bidi w:val="0"/>
+              <w:spacing w:after="0"/>
+            </w:pPr>
+            <w:r>
+              <w:t xml:space="preserve">3</w:t>
+            </w:r>
+          </w:p>
+        </w:tc>
+        <w:tc>
+          <w:tcPr>
+            <w:tcW w:w="1831" w:type="pct"/>
+          </w:tcPr>
+          <w:p>
+            <w:pPr>
+              <w:keepNext/>
+              <w:keepLines/>
+              <w:bidi w:val="0"/>
+              <w:spacing w:after="0"/>
+            </w:pPr>
+            <w:r>
+              <w:t xml:space="preserve">Computer Applications</w:t>
+            </w:r>
+          </w:p>
+        </w:tc>
+        <w:tc>
+          <w:tcPr>
+            <w:tcW w:w="339" w:type="pct"/>
+          </w:tcPr>
+          <w:p>
+            <w:pPr>
+              <w:keepNext/>
+              <w:keepLines/>
+              <w:bidi w:val="0"/>
+              <w:spacing w:after="0"/>
+            </w:pPr>
+            <w:r>
+              <w:t xml:space="preserve">61.0</w:t>
+            </w:r>
+          </w:p>
+        </w:tc>
+        <w:tc>
+          <w:tcPr>
+            <w:tcW w:w="325" w:type="pct"/>
+          </w:tcPr>
+          <w:p>
+            <w:pPr>
+              <w:keepNext/>
+              <w:keepLines/>
+              <w:bidi w:val="0"/>
+              <w:spacing w:after="0"/>
+            </w:pPr>
+            <w:r>
+              <w:t xml:space="preserve">2</w:t>
+            </w:r>
+          </w:p>
+        </w:tc>
+      </w:tr>
+      <w:tr>
+        <w:trPr>
+          <w:cantSplit/>
+        </w:trPr>
+        <w:tc>
+          <w:tcPr>
+            <w:tcW w:w="1828" w:type="pct"/>
+          </w:tcPr>
+          <w:p>
+            <w:pPr>
+              <w:keepNext/>
+              <w:keepLines/>
+              <w:bidi w:val="0"/>
+              <w:spacing w:after="0"/>
+            </w:pPr>
+            <w:r>
+              <w:t xml:space="preserve">Arabic Language</w:t>
+            </w:r>
+          </w:p>
+        </w:tc>
+        <w:tc>
+          <w:tcPr>
+            <w:tcW w:w="338" w:type="pct"/>
+          </w:tcPr>
+          <w:p>
+            <w:pPr>
+              <w:keepNext/>
+              <w:keepLines/>
+              <w:bidi w:val="0"/>
+              <w:spacing w:after="0"/>
+            </w:pPr>
+            <w:r>
+              <w:t xml:space="preserve">63.0</w:t>
+            </w:r>
+          </w:p>
+        </w:tc>
+        <w:tc>
+          <w:tcPr>
+            <w:tcW w:w="339" w:type="pct"/>
+          </w:tcPr>
+          <w:p>
+            <w:pPr>
+              <w:keepNext/>
+              <w:keepLines/>
+              <w:bidi w:val="0"/>
+              <w:spacing w:after="0"/>
+            </w:pPr>
+            <w:r>
+              <w:t xml:space="preserve">2</w:t>
+            </w:r>
+          </w:p>
+        </w:tc>
+        <w:tc>
+          <w:tcPr>
+            <w:tcW w:w="1831" w:type="pct"/>
+          </w:tcPr>
+          <w:p>
+            <w:pPr>
+              <w:keepNext/>
+              <w:keepLines/>
+              <w:bidi w:val="0"/>
+              <w:spacing w:after="0"/>
+            </w:pPr>
+            <w:r>
+              <w:t xml:space="preserve">Principles of Information Technology</w:t>
+            </w:r>
+          </w:p>
+        </w:tc>
+        <w:tc>
+          <w:tcPr>
+            <w:tcW w:w="339" w:type="pct"/>
+          </w:tcPr>
+          <w:p>
+            <w:pPr>
+              <w:keepNext/>
+              <w:keepLines/>
+              <w:bidi w:val="0"/>
+              <w:spacing w:after="0"/>
+            </w:pPr>
+            <w:r>
+              <w:t xml:space="preserve">50.0</w:t>
+            </w:r>
+          </w:p>
+        </w:tc>
+        <w:tc>
+          <w:tcPr>
+            <w:tcW w:w="325" w:type="pct"/>
+          </w:tcPr>
+          <w:p>
+            <w:pPr>
+              <w:keepNext/>
+              <w:keepLines/>
+              <w:bidi w:val="0"/>
+              <w:spacing w:after="0"/>
+            </w:pPr>
+            <w:r>
+              <w:t xml:space="preserve">3</w:t>
+            </w:r>
+          </w:p>
+        </w:tc>
+      </w:tr>
+      <w:tr>
+        <w:trPr>
+          <w:cantSplit/>
+        </w:trPr>
+        <w:tc>
+          <w:tcPr>
+            <w:tcW w:w="1828" w:type="pct"/>
+          </w:tcPr>
+          <w:p>
+            <w:pPr>
+              <w:keepNext/>
+              <w:keepLines/>
+              <w:bidi w:val="0"/>
+              <w:spacing w:after="0"/>
+            </w:pPr>
+            <w:r>
+              <w:t xml:space="preserve">Computer Skills</w:t>
+            </w:r>
+          </w:p>
+        </w:tc>
+        <w:tc>
+          <w:tcPr>
+            <w:tcW w:w="338" w:type="pct"/>
+          </w:tcPr>
+          <w:p>
+            <w:pPr>
+              <w:keepNext/>
+              <w:keepLines/>
+              <w:bidi w:val="0"/>
+              <w:spacing w:after="0"/>
+            </w:pPr>
+            <w:r>
+              <w:t xml:space="preserve">58.0</w:t>
+            </w:r>
+          </w:p>
+        </w:tc>
+        <w:tc>
+          <w:tcPr>
+            <w:tcW w:w="339" w:type="pct"/>
+          </w:tcPr>
+          <w:p>
+            <w:pPr>
+              <w:keepNext/>
+              <w:keepLines/>
+              <w:bidi w:val="0"/>
+              <w:spacing w:after="0"/>
+            </w:pPr>
+            <w:r>
+              <w:t xml:space="preserve">2</w:t>
+            </w:r>
+          </w:p>
+        </w:tc>
+        <w:tc>
+          <w:tcPr>
+            <w:tcW w:w="1831" w:type="pct"/>
+          </w:tcPr>
+          <w:p>
+            <w:pPr>
+              <w:keepNext/>
+              <w:keepLines/>
+              <w:bidi w:val="0"/>
+              <w:spacing w:after="0"/>
+            </w:pPr>
+            <w:r>
+              <w:t xml:space="preserve"/>
+            </w:r>
+          </w:p>
+        </w:tc>
+        <w:tc>
+          <w:tcPr>
+            <w:tcW w:w="339" w:type="pct"/>
+          </w:tcPr>
+          <w:p>
+            <w:pPr>
+              <w:keepNext/>
+              <w:keepLines/>
+              <w:bidi w:val="0"/>
+              <w:spacing w:after="0"/>
+            </w:pPr>
+            <w:r>
+              <w:t xml:space="preserve"/>
+            </w:r>
+          </w:p>
+        </w:tc>
+        <w:tc>
+          <w:tcPr>
+            <w:tcW w:w="325" w:type="pct"/>
+          </w:tcPr>
+          <w:p>
+            <w:pPr>
+              <w:keepNext/>
+              <w:keepLines/>
+              <w:bidi w:val="0"/>
+              <w:spacing w:after="0"/>
+            </w:pPr>
+            <w:r>
+              <w:t xml:space="preserve"/>
+            </w:r>
+          </w:p>
+        </w:tc>
+      </w:tr>
+    </w:tbl>
+    <w:p>
+      <w:pPr>
+        <w:keepNext/>
+        <w:keepLines/>
+        <w:bidi w:val="0"/>
+        <w:spacing w:line="240" w:lineRule="auto"/>
+      </w:pPr>
+      <w:r>
+        <w:t xml:space="preserve"/>
+      </w:r>
+    </w:p>
+    <w:tbl>
+      <w:tblPr>
+        <w:tblStyle w:val="TableGrid"/>
+        <w:tblW w:w="5000" w:type="pct"/>
+        <w:tblLayout w:type="fixed"/>
+        <w:tblLook w:val="04A0" w:firstRow="1" w:lastRow="0" w:firstColumn="1" w:lastColumn="0" w:noHBand="0" w:noVBand="1"/>
+      </w:tblPr>
+      <w:tblGrid>
+        <w:gridCol w:w="3822"/>
+        <w:gridCol w:w="707"/>
+        <w:gridCol w:w="709"/>
+        <w:gridCol w:w="3829"/>
+        <w:gridCol w:w="709"/>
+        <w:gridCol w:w="680"/>
+      </w:tblGrid>
+      <w:tr>
+        <w:trPr>
+          <w:cantSplit/>
+        </w:trPr>
+        <w:tc>
+          <w:tcPr>
+            <w:tcW w:w="2505" w:type="pct"/>
+            <w:gridSpan w:val="3"/>
+          </w:tcPr>
+          <w:p>
+            <w:pPr>
+              <w:keepNext/>
+              <w:keepLines/>
+              <w:bidi w:val="0"/>
+              <w:spacing w:after="0"/>
+            </w:pPr>
+            <w:r>
+              <w:t xml:space="preserve">Semester 3 - 2016-2017</w:t>
+            </w:r>
+          </w:p>
+        </w:tc>
+        <w:tc>
+          <w:tcPr>
+            <w:tcW w:w="2495" w:type="pct"/>
+            <w:gridSpan w:val="3"/>
+          </w:tcPr>
+          <w:p>
+            <w:pPr>
+              <w:keepNext/>
+              <w:keepLines/>
+              <w:bidi w:val="0"/>
+              <w:spacing w:after="0"/>
+            </w:pPr>
+            <w:r>
+              <w:t xml:space="preserve">Semester 4 - 2016-2017</w:t>
+            </w:r>
+          </w:p>
+        </w:tc>
+      </w:tr>
+      <w:tr>
+        <w:trPr>
+          <w:cantSplit/>
+        </w:trPr>
+        <w:tc>
+          <w:tcPr>
+            <w:tcW w:w="1828" w:type="pct"/>
+          </w:tcPr>
+          <w:p>
+            <w:pPr>
+              <w:keepNext/>
+              <w:keepLines/>
+              <w:bidi w:val="0"/>
+              <w:spacing w:after="0"/>
+            </w:pPr>
+            <w:r>
+              <w:t>Subject</w:t>
+            </w:r>
+          </w:p>
+        </w:tc>
+        <w:tc>
+          <w:tcPr>
+            <w:tcW w:w="338" w:type="pct"/>
+          </w:tcPr>
+          <w:p>
+            <w:pPr>
+              <w:keepNext/>
+              <w:keepLines/>
+              <w:bidi w:val="0"/>
+              <w:spacing w:after="0"/>
+            </w:pPr>
+            <w:r>
+              <w:t>Mark</w:t>
+            </w:r>
+          </w:p>
+        </w:tc>
+        <w:tc>
+          <w:tcPr>
+            <w:tcW w:w="339" w:type="pct"/>
+          </w:tcPr>
+          <w:p>
+            <w:pPr>
+              <w:keepNext/>
+              <w:keepLines/>
+              <w:bidi w:val="0"/>
+              <w:spacing w:after="0"/>
+            </w:pPr>
+            <w:r>
+              <w:t>Unit</w:t>
+            </w:r>
+          </w:p>
+        </w:tc>
+        <w:tc>
+          <w:tcPr>
+            <w:tcW w:w="1831" w:type="pct"/>
+          </w:tcPr>
+          <w:p>
+            <w:pPr>
+              <w:keepNext/>
+              <w:keepLines/>
+              <w:bidi w:val="0"/>
+              <w:spacing w:after="0"/>
+            </w:pPr>
+            <w:r>
+              <w:t>Subject</w:t>
+            </w:r>
+          </w:p>
+        </w:tc>
+        <w:tc>
+          <w:tcPr>
+            <w:tcW w:w="339" w:type="pct"/>
+          </w:tcPr>
+          <w:p>
+            <w:pPr>
+              <w:keepNext/>
+              <w:keepLines/>
+              <w:bidi w:val="0"/>
+              <w:spacing w:after="0"/>
+            </w:pPr>
+            <w:r>
+              <w:t>Mark</w:t>
+            </w:r>
+          </w:p>
+        </w:tc>
+        <w:tc>
+          <w:tcPr>
+            <w:tcW w:w="325" w:type="pct"/>
+          </w:tcPr>
+          <w:p>
+            <w:pPr>
+              <w:keepNext/>
+              <w:keepLines/>
+              <w:bidi w:val="0"/>
+              <w:spacing w:after="0"/>
+            </w:pPr>
+            <w:r>
+              <w:t xml:space="preserve">Unit</w:t>
+            </w:r>
+          </w:p>
+        </w:tc>
+      </w:tr>
+      <w:tr>
+        <w:trPr>
+          <w:cantSplit/>
+        </w:trPr>
+        <w:tc>
+          <w:tcPr>
+            <w:tcW w:w="1828" w:type="pct"/>
+          </w:tcPr>
+          <w:p>
+            <w:pPr>
+              <w:keepNext/>
+              <w:keepLines/>
+              <w:bidi w:val="0"/>
+              <w:spacing w:after="0"/>
+            </w:pPr>
+            <w:r>
+              <w:t xml:space="preserve">Programming II</w:t>
+            </w:r>
+          </w:p>
+        </w:tc>
+        <w:tc>
+          <w:tcPr>
+            <w:tcW w:w="338" w:type="pct"/>
+          </w:tcPr>
+          <w:p>
+            <w:pPr>
+              <w:keepNext/>
+              <w:keepLines/>
+              <w:bidi w:val="0"/>
+              <w:spacing w:after="0"/>
+            </w:pPr>
+            <w:r>
+              <w:t xml:space="preserve">50.0</w:t>
+            </w:r>
+          </w:p>
+        </w:tc>
+        <w:tc>
+          <w:tcPr>
+            <w:tcW w:w="339" w:type="pct"/>
+          </w:tcPr>
+          <w:p>
+            <w:pPr>
+              <w:keepNext/>
+              <w:keepLines/>
+              <w:bidi w:val="0"/>
+              <w:spacing w:after="0"/>
+            </w:pPr>
+            <w:r>
+              <w:t xml:space="preserve">4</w:t>
+            </w:r>
+          </w:p>
+        </w:tc>
+        <w:tc>
+          <w:tcPr>
+            <w:tcW w:w="1831" w:type="pct"/>
+          </w:tcPr>
+          <w:p>
+            <w:pPr>
+              <w:keepNext/>
+              <w:keepLines/>
+              <w:bidi w:val="0"/>
+              <w:spacing w:after="0"/>
+            </w:pPr>
+            <w:r>
+              <w:t xml:space="preserve">Visual Programming</w:t>
+            </w:r>
+          </w:p>
+        </w:tc>
+        <w:tc>
+          <w:tcPr>
+            <w:tcW w:w="339" w:type="pct"/>
+          </w:tcPr>
+          <w:p>
+            <w:pPr>
+              <w:keepNext/>
+              <w:keepLines/>
+              <w:bidi w:val="0"/>
+              <w:spacing w:after="0"/>
+            </w:pPr>
+            <w:r>
+              <w:t xml:space="preserve">50.0</w:t>
+            </w:r>
+          </w:p>
+        </w:tc>
+        <w:tc>
+          <w:tcPr>
+            <w:tcW w:w="325" w:type="pct"/>
+          </w:tcPr>
+          <w:p>
+            <w:pPr>
+              <w:keepNext/>
+              <w:keepLines/>
+              <w:bidi w:val="0"/>
+              <w:spacing w:after="0"/>
+            </w:pPr>
+            <w:r>
+              <w:t xml:space="preserve">3</w:t>
+            </w:r>
+          </w:p>
+        </w:tc>
+      </w:tr>
+      <w:tr>
+        <w:trPr>
+          <w:cantSplit/>
+        </w:trPr>
+        <w:tc>
+          <w:tcPr>
+            <w:tcW w:w="1828" w:type="pct"/>
+          </w:tcPr>
+          <w:p>
+            <w:pPr>
+              <w:keepNext/>
+              <w:keepLines/>
+              <w:bidi w:val="0"/>
+              <w:spacing w:after="0"/>
+            </w:pPr>
+            <w:r>
+              <w:t xml:space="preserve">Human Rights</w:t>
+            </w:r>
+          </w:p>
+        </w:tc>
+        <w:tc>
+          <w:tcPr>
+            <w:tcW w:w="338" w:type="pct"/>
+          </w:tcPr>
+          <w:p>
+            <w:pPr>
+              <w:keepNext/>
+              <w:keepLines/>
+              <w:bidi w:val="0"/>
+              <w:spacing w:after="0"/>
+            </w:pPr>
+            <w:r>
+              <w:t xml:space="preserve">53.0</w:t>
+            </w:r>
+          </w:p>
+        </w:tc>
+        <w:tc>
+          <w:tcPr>
+            <w:tcW w:w="339" w:type="pct"/>
+          </w:tcPr>
+          <w:p>
+            <w:pPr>
+              <w:keepNext/>
+              <w:keepLines/>
+              <w:bidi w:val="0"/>
+              <w:spacing w:after="0"/>
+            </w:pPr>
+            <w:r>
+              <w:t xml:space="preserve">1</w:t>
+            </w:r>
+          </w:p>
+        </w:tc>
+        <w:tc>
+          <w:tcPr>
+            <w:tcW w:w="1831" w:type="pct"/>
+          </w:tcPr>
+          <w:p>
+            <w:pPr>
+              <w:keepNext/>
+              <w:keepLines/>
+              <w:bidi w:val="0"/>
+              <w:spacing w:after="0"/>
+            </w:pPr>
+            <w:r>
+              <w:t xml:space="preserve">Computer Graphics 2D</w:t>
+            </w:r>
+          </w:p>
+        </w:tc>
+        <w:tc>
+          <w:tcPr>
+            <w:tcW w:w="339" w:type="pct"/>
+          </w:tcPr>
+          <w:p>
+            <w:pPr>
+              <w:keepNext/>
+              <w:keepLines/>
+              <w:bidi w:val="0"/>
+              <w:spacing w:after="0"/>
+            </w:pPr>
+            <w:r>
+              <w:t xml:space="preserve">74.0</w:t>
+            </w:r>
+          </w:p>
+        </w:tc>
+        <w:tc>
+          <w:tcPr>
+            <w:tcW w:w="325" w:type="pct"/>
+          </w:tcPr>
+          <w:p>
+            <w:pPr>
+              <w:keepNext/>
+              <w:keepLines/>
+              <w:bidi w:val="0"/>
+              <w:spacing w:after="0"/>
+            </w:pPr>
+            <w:r>
+              <w:t xml:space="preserve">3</w:t>
+            </w:r>
+          </w:p>
+        </w:tc>
+      </w:tr>
+      <w:tr>
+        <w:trPr>
+          <w:cantSplit/>
+        </w:trPr>
+        <w:tc>
+          <w:tcPr>
+            <w:tcW w:w="1828" w:type="pct"/>
+          </w:tcPr>
+          <w:p>
+            <w:pPr>
+              <w:keepNext/>
+              <w:keepLines/>
+              <w:bidi w:val="0"/>
+              <w:spacing w:after="0"/>
+            </w:pPr>
+            <w:r>
+              <w:t xml:space="preserve">Numerical Methods</w:t>
+            </w:r>
+          </w:p>
+        </w:tc>
+        <w:tc>
+          <w:tcPr>
+            <w:tcW w:w="338" w:type="pct"/>
+          </w:tcPr>
+          <w:p>
+            <w:pPr>
+              <w:keepNext/>
+              <w:keepLines/>
+              <w:bidi w:val="0"/>
+              <w:spacing w:after="0"/>
+            </w:pPr>
+            <w:r>
+              <w:t xml:space="preserve">67.0</w:t>
+            </w:r>
+          </w:p>
+        </w:tc>
+        <w:tc>
+          <w:tcPr>
+            <w:tcW w:w="339" w:type="pct"/>
+          </w:tcPr>
+          <w:p>
+            <w:pPr>
+              <w:keepNext/>
+              <w:keepLines/>
+              <w:bidi w:val="0"/>
+              <w:spacing w:after="0"/>
+            </w:pPr>
+            <w:r>
+              <w:t xml:space="preserve">3</w:t>
+            </w:r>
+          </w:p>
+        </w:tc>
+        <w:tc>
+          <w:tcPr>
+            <w:tcW w:w="1831" w:type="pct"/>
+          </w:tcPr>
+          <w:p>
+            <w:pPr>
+              <w:keepNext/>
+              <w:keepLines/>
+              <w:bidi w:val="0"/>
+              <w:spacing w:after="0"/>
+            </w:pPr>
+            <w:r>
+              <w:t xml:space="preserve">Programming Logic Controller</w:t>
+            </w:r>
+          </w:p>
+        </w:tc>
+        <w:tc>
+          <w:tcPr>
+            <w:tcW w:w="339" w:type="pct"/>
+          </w:tcPr>
+          <w:p>
+            <w:pPr>
+              <w:keepNext/>
+              <w:keepLines/>
+              <w:bidi w:val="0"/>
+              <w:spacing w:after="0"/>
+            </w:pPr>
+            <w:r>
+              <w:t xml:space="preserve">62.0</w:t>
+            </w:r>
+          </w:p>
+        </w:tc>
+        <w:tc>
+          <w:tcPr>
+            <w:tcW w:w="325" w:type="pct"/>
+          </w:tcPr>
+          <w:p>
+            <w:pPr>
+              <w:keepNext/>
+              <w:keepLines/>
+              <w:bidi w:val="0"/>
+              <w:spacing w:after="0"/>
+            </w:pPr>
+            <w:r>
+              <w:t xml:space="preserve">3</w:t>
+            </w:r>
+          </w:p>
+        </w:tc>
+      </w:tr>
+      <w:tr>
+        <w:trPr>
+          <w:cantSplit/>
+        </w:trPr>
+        <w:tc>
+          <w:tcPr>
+            <w:tcW w:w="1828" w:type="pct"/>
+          </w:tcPr>
+          <w:p>
+            <w:pPr>
+              <w:keepNext/>
+              <w:keepLines/>
+              <w:bidi w:val="0"/>
+              <w:spacing w:after="0"/>
+            </w:pPr>
+            <w:r>
+              <w:t xml:space="preserve">Microprocessors and Assembly Language</w:t>
+            </w:r>
+          </w:p>
+        </w:tc>
+        <w:tc>
+          <w:tcPr>
+            <w:tcW w:w="338" w:type="pct"/>
+          </w:tcPr>
+          <w:p>
+            <w:pPr>
+              <w:keepNext/>
+              <w:keepLines/>
+              <w:bidi w:val="0"/>
+              <w:spacing w:after="0"/>
+            </w:pPr>
+            <w:r>
+              <w:t xml:space="preserve">56.0</w:t>
+            </w:r>
+          </w:p>
+        </w:tc>
+        <w:tc>
+          <w:tcPr>
+            <w:tcW w:w="339" w:type="pct"/>
+          </w:tcPr>
+          <w:p>
+            <w:pPr>
+              <w:keepNext/>
+              <w:keepLines/>
+              <w:bidi w:val="0"/>
+              <w:spacing w:after="0"/>
+            </w:pPr>
+            <w:r>
+              <w:t xml:space="preserve">3</w:t>
+            </w:r>
+          </w:p>
+        </w:tc>
+        <w:tc>
+          <w:tcPr>
+            <w:tcW w:w="1831" w:type="pct"/>
+          </w:tcPr>
+          <w:p>
+            <w:pPr>
+              <w:keepNext/>
+              <w:keepLines/>
+              <w:bidi w:val="0"/>
+              <w:spacing w:after="0"/>
+            </w:pPr>
+            <w:r>
+              <w:t xml:space="preserve">Computation Theory</w:t>
+            </w:r>
+          </w:p>
+        </w:tc>
+        <w:tc>
+          <w:tcPr>
+            <w:tcW w:w="339" w:type="pct"/>
+          </w:tcPr>
+          <w:p>
+            <w:pPr>
+              <w:keepNext/>
+              <w:keepLines/>
+              <w:bidi w:val="0"/>
+              <w:spacing w:after="0"/>
+            </w:pPr>
+            <w:r>
+              <w:t xml:space="preserve">61.0</w:t>
+            </w:r>
+          </w:p>
+        </w:tc>
+        <w:tc>
+          <w:tcPr>
+            <w:tcW w:w="325" w:type="pct"/>
+          </w:tcPr>
+          <w:p>
+            <w:pPr>
+              <w:keepNext/>
+              <w:keepLines/>
+              <w:bidi w:val="0"/>
+              <w:spacing w:after="0"/>
+            </w:pPr>
+            <w:r>
+              <w:t xml:space="preserve">3</w:t>
+            </w:r>
+          </w:p>
+        </w:tc>
+      </w:tr>
+      <w:tr>
+        <w:trPr>
+          <w:cantSplit/>
+        </w:trPr>
+        <w:tc>
+          <w:tcPr>
+            <w:tcW w:w="1828" w:type="pct"/>
+          </w:tcPr>
+          <w:p>
+            <w:pPr>
+              <w:keepNext/>
+              <w:keepLines/>
+              <w:bidi w:val="0"/>
+              <w:spacing w:after="0"/>
+            </w:pPr>
+            <w:r>
+              <w:t xml:space="preserve">Probability and Statistics</w:t>
+            </w:r>
+          </w:p>
+        </w:tc>
+        <w:tc>
+          <w:tcPr>
+            <w:tcW w:w="338" w:type="pct"/>
+          </w:tcPr>
+          <w:p>
+            <w:pPr>
+              <w:keepNext/>
+              <w:keepLines/>
+              <w:bidi w:val="0"/>
+              <w:spacing w:after="0"/>
+            </w:pPr>
+            <w:r>
+              <w:t xml:space="preserve">50.0</w:t>
+            </w:r>
+          </w:p>
+        </w:tc>
+        <w:tc>
+          <w:tcPr>
+            <w:tcW w:w="339" w:type="pct"/>
+          </w:tcPr>
+          <w:p>
+            <w:pPr>
+              <w:keepNext/>
+              <w:keepLines/>
+              <w:bidi w:val="0"/>
+              <w:spacing w:after="0"/>
+            </w:pPr>
+            <w:r>
+              <w:t xml:space="preserve">3</w:t>
+            </w:r>
+          </w:p>
+        </w:tc>
+        <w:tc>
+          <w:tcPr>
+            <w:tcW w:w="1831" w:type="pct"/>
+          </w:tcPr>
+          <w:p>
+            <w:pPr>
+              <w:keepNext/>
+              <w:keepLines/>
+              <w:bidi w:val="0"/>
+              <w:spacing w:after="0"/>
+            </w:pPr>
+            <w:r>
+              <w:t xml:space="preserve">Computer Applications in Business</w:t>
+            </w:r>
+          </w:p>
+        </w:tc>
+        <w:tc>
+          <w:tcPr>
+            <w:tcW w:w="339" w:type="pct"/>
+          </w:tcPr>
+          <w:p>
+            <w:pPr>
+              <w:keepNext/>
+              <w:keepLines/>
+              <w:bidi w:val="0"/>
+              <w:spacing w:after="0"/>
+            </w:pPr>
+            <w:r>
+              <w:t xml:space="preserve">64.0</w:t>
+            </w:r>
+          </w:p>
+        </w:tc>
+        <w:tc>
+          <w:tcPr>
+            <w:tcW w:w="325" w:type="pct"/>
+          </w:tcPr>
+          <w:p>
+            <w:pPr>
+              <w:keepNext/>
+              <w:keepLines/>
+              <w:bidi w:val="0"/>
+              <w:spacing w:after="0"/>
+            </w:pPr>
+            <w:r>
+              <w:t xml:space="preserve">2</w:t>
+            </w:r>
+          </w:p>
+        </w:tc>
+      </w:tr>
+      <w:tr>
+        <w:trPr>
+          <w:cantSplit/>
+        </w:trPr>
+        <w:tc>
+          <w:tcPr>
+            <w:tcW w:w="1828" w:type="pct"/>
+          </w:tcPr>
+          <w:p>
+            <w:pPr>
+              <w:keepNext/>
+              <w:keepLines/>
+              <w:bidi w:val="0"/>
+              <w:spacing w:after="0"/>
+            </w:pPr>
+            <w:r>
+              <w:t xml:space="preserve"/>
+            </w:r>
+          </w:p>
+        </w:tc>
+        <w:tc>
+          <w:tcPr>
+            <w:tcW w:w="338" w:type="pct"/>
+          </w:tcPr>
+          <w:p>
+            <w:pPr>
+              <w:keepNext/>
+              <w:keepLines/>
+              <w:bidi w:val="0"/>
+              <w:spacing w:after="0"/>
+            </w:pPr>
+            <w:r>
+              <w:t xml:space="preserve"/>
+            </w:r>
+          </w:p>
+        </w:tc>
+        <w:tc>
+          <w:tcPr>
+            <w:tcW w:w="339" w:type="pct"/>
+          </w:tcPr>
+          <w:p>
+            <w:pPr>
+              <w:keepNext/>
+              <w:keepLines/>
+              <w:bidi w:val="0"/>
+              <w:spacing w:after="0"/>
+            </w:pPr>
+            <w:r>
+              <w:t xml:space="preserve"/>
+            </w:r>
+          </w:p>
+        </w:tc>
+        <w:tc>
+          <w:tcPr>
+            <w:tcW w:w="1831" w:type="pct"/>
+          </w:tcPr>
+          <w:p>
+            <w:pPr>
+              <w:keepNext/>
+              <w:keepLines/>
+              <w:bidi w:val="0"/>
+              <w:spacing w:after="0"/>
+            </w:pPr>
+            <w:r>
+              <w:t xml:space="preserve">Human Interaction with Computer</w:t>
+            </w:r>
+          </w:p>
+        </w:tc>
+        <w:tc>
+          <w:tcPr>
+            <w:tcW w:w="339" w:type="pct"/>
+          </w:tcPr>
+          <w:p>
+            <w:pPr>
+              <w:keepNext/>
+              <w:keepLines/>
+              <w:bidi w:val="0"/>
+              <w:spacing w:after="0"/>
+            </w:pPr>
+            <w:r>
+              <w:t xml:space="preserve">79.0</w:t>
+            </w:r>
+          </w:p>
+        </w:tc>
+        <w:tc>
+          <w:tcPr>
+            <w:tcW w:w="325" w:type="pct"/>
+          </w:tcPr>
+          <w:p>
+            <w:pPr>
+              <w:keepNext/>
+              <w:keepLines/>
+              <w:bidi w:val="0"/>
+              <w:spacing w:after="0"/>
+            </w:pPr>
+            <w:r>
+              <w:t xml:space="preserve">2</w:t>
+            </w:r>
+          </w:p>
+        </w:tc>
+      </w:tr>
+    </w:tbl>
+    <w:p>
+      <w:pPr>
+        <w:keepNext/>
+        <w:keepLines/>
+        <w:bidi w:val="0"/>
+        <w:spacing w:line="240" w:lineRule="auto"/>
+      </w:pPr>
+      <w:r>
+        <w:t xml:space="preserve"/>
+      </w:r>
+    </w:p>
+    <w:tbl>
+      <w:tblPr>
+        <w:tblStyle w:val="TableGrid"/>
+        <w:tblW w:w="5000" w:type="pct"/>
+        <w:tblLayout w:type="fixed"/>
+        <w:tblLook w:val="04A0" w:firstRow="1" w:lastRow="0" w:firstColumn="1" w:lastColumn="0" w:noHBand="0" w:noVBand="1"/>
+      </w:tblPr>
+      <w:tblGrid>
+        <w:gridCol w:w="3822"/>
+        <w:gridCol w:w="707"/>
+        <w:gridCol w:w="709"/>
+        <w:gridCol w:w="3829"/>
+        <w:gridCol w:w="709"/>
+        <w:gridCol w:w="680"/>
+      </w:tblGrid>
+      <w:tr>
+        <w:trPr>
+          <w:cantSplit/>
+        </w:trPr>
+        <w:tc>
+          <w:tcPr>
+            <w:tcW w:w="2505" w:type="pct"/>
+            <w:gridSpan w:val="3"/>
+          </w:tcPr>
+          <w:p>
+            <w:pPr>
+              <w:keepNext/>
+              <w:keepLines/>
+              <w:bidi w:val="0"/>
+              <w:spacing w:after="0"/>
+            </w:pPr>
+            <w:r>
+              <w:t xml:space="preserve">Semester 5 - 2017-2018</w:t>
+            </w:r>
+          </w:p>
+        </w:tc>
+        <w:tc>
+          <w:tcPr>
+            <w:tcW w:w="2495" w:type="pct"/>
+            <w:gridSpan w:val="3"/>
+          </w:tcPr>
+          <w:p>
+            <w:pPr>
+              <w:keepNext/>
+              <w:keepLines/>
+              <w:bidi w:val="0"/>
+              <w:spacing w:after="0"/>
+            </w:pPr>
+            <w:r>
+              <w:t xml:space="preserve">Semester 6 - 2017-2018</w:t>
+            </w:r>
+          </w:p>
+        </w:tc>
+      </w:tr>
+      <w:tr>
+        <w:trPr>
+          <w:cantSplit/>
+        </w:trPr>
+        <w:tc>
+          <w:tcPr>
+            <w:tcW w:w="1828" w:type="pct"/>
+          </w:tcPr>
+          <w:p>
+            <w:pPr>
+              <w:keepNext/>
+              <w:keepLines/>
+              <w:bidi w:val="0"/>
+              <w:spacing w:after="0"/>
+            </w:pPr>
+            <w:r>
+              <w:t>Subject</w:t>
+            </w:r>
+          </w:p>
+        </w:tc>
+        <w:tc>
+          <w:tcPr>
+            <w:tcW w:w="338" w:type="pct"/>
+          </w:tcPr>
+          <w:p>
+            <w:pPr>
+              <w:keepNext/>
+              <w:keepLines/>
+              <w:bidi w:val="0"/>
+              <w:spacing w:after="0"/>
+            </w:pPr>
+            <w:r>
+              <w:t>Mark</w:t>
+            </w:r>
+          </w:p>
+        </w:tc>
+        <w:tc>
+          <w:tcPr>
+            <w:tcW w:w="339" w:type="pct"/>
+          </w:tcPr>
+          <w:p>
+            <w:pPr>
+              <w:keepNext/>
+              <w:keepLines/>
+              <w:bidi w:val="0"/>
+              <w:spacing w:after="0"/>
+            </w:pPr>
+            <w:r>
+              <w:t>Unit</w:t>
+            </w:r>
+          </w:p>
+        </w:tc>
+        <w:tc>
+          <w:tcPr>
+            <w:tcW w:w="1831" w:type="pct"/>
+          </w:tcPr>
+          <w:p>
+            <w:pPr>
+              <w:keepNext/>
+              <w:keepLines/>
+              <w:bidi w:val="0"/>
+              <w:spacing w:after="0"/>
+            </w:pPr>
+            <w:r>
+              <w:t>Subject</w:t>
+            </w:r>
+          </w:p>
+        </w:tc>
+        <w:tc>
+          <w:tcPr>
+            <w:tcW w:w="339" w:type="pct"/>
+          </w:tcPr>
+          <w:p>
+            <w:pPr>
+              <w:keepNext/>
+              <w:keepLines/>
+              <w:bidi w:val="0"/>
+              <w:spacing w:after="0"/>
+            </w:pPr>
+            <w:r>
+              <w:t>Mark</w:t>
+            </w:r>
+          </w:p>
+        </w:tc>
+        <w:tc>
+          <w:tcPr>
+            <w:tcW w:w="325" w:type="pct"/>
+          </w:tcPr>
+          <w:p>
+            <w:pPr>
+              <w:keepNext/>
+              <w:keepLines/>
+              <w:bidi w:val="0"/>
+              <w:spacing w:after="0"/>
+            </w:pPr>
+            <w:r>
+              <w:t xml:space="preserve">Unit</w:t>
+            </w:r>
+          </w:p>
+        </w:tc>
+      </w:tr>
+      <w:tr>
+        <w:trPr>
+          <w:cantSplit/>
+        </w:trPr>
+        <w:tc>
+          <w:tcPr>
+            <w:tcW w:w="1828" w:type="pct"/>
+          </w:tcPr>
+          <w:p>
+            <w:pPr>
+              <w:keepNext/>
+              <w:keepLines/>
+              <w:bidi w:val="0"/>
+              <w:spacing w:after="0"/>
+            </w:pPr>
+            <w:r>
+              <w:t xml:space="preserve">Fundamentals of Databases</w:t>
+            </w:r>
+          </w:p>
+        </w:tc>
+        <w:tc>
+          <w:tcPr>
+            <w:tcW w:w="338" w:type="pct"/>
+          </w:tcPr>
+          <w:p>
+            <w:pPr>
+              <w:keepNext/>
+              <w:keepLines/>
+              <w:bidi w:val="0"/>
+              <w:spacing w:after="0"/>
+            </w:pPr>
+            <w:r>
+              <w:t xml:space="preserve">53.0</w:t>
+            </w:r>
+          </w:p>
+        </w:tc>
+        <w:tc>
+          <w:tcPr>
+            <w:tcW w:w="339" w:type="pct"/>
+          </w:tcPr>
+          <w:p>
+            <w:pPr>
+              <w:keepNext/>
+              <w:keepLines/>
+              <w:bidi w:val="0"/>
+              <w:spacing w:after="0"/>
+            </w:pPr>
+            <w:r>
+              <w:t xml:space="preserve">3</w:t>
+            </w:r>
+          </w:p>
+        </w:tc>
+        <w:tc>
+          <w:tcPr>
+            <w:tcW w:w="1831" w:type="pct"/>
+          </w:tcPr>
+          <w:p>
+            <w:pPr>
+              <w:keepNext/>
+              <w:keepLines/>
+              <w:bidi w:val="0"/>
+              <w:spacing w:after="0"/>
+            </w:pPr>
+            <w:r>
+              <w:t xml:space="preserve">Fundamentals of Artificial Intelligence</w:t>
+            </w:r>
+          </w:p>
+        </w:tc>
+        <w:tc>
+          <w:tcPr>
+            <w:tcW w:w="339" w:type="pct"/>
+          </w:tcPr>
+          <w:p>
+            <w:pPr>
+              <w:keepNext/>
+              <w:keepLines/>
+              <w:bidi w:val="0"/>
+              <w:spacing w:after="0"/>
+            </w:pPr>
+            <w:r>
+              <w:t xml:space="preserve">50.0</w:t>
+            </w:r>
+          </w:p>
+        </w:tc>
+        <w:tc>
+          <w:tcPr>
+            <w:tcW w:w="325" w:type="pct"/>
+          </w:tcPr>
+          <w:p>
+            <w:pPr>
+              <w:keepNext/>
+              <w:keepLines/>
+              <w:bidi w:val="0"/>
+              <w:spacing w:after="0"/>
+            </w:pPr>
+            <w:r>
+              <w:t xml:space="preserve">3</w:t>
+            </w:r>
+          </w:p>
+        </w:tc>
+      </w:tr>
+      <w:tr>
+        <w:trPr>
+          <w:cantSplit/>
+        </w:trPr>
+        <w:tc>
+          <w:tcPr>
+            <w:tcW w:w="1828" w:type="pct"/>
+          </w:tcPr>
+          <w:p>
+            <w:pPr>
+              <w:keepNext/>
+              <w:keepLines/>
+              <w:bidi w:val="0"/>
+              <w:spacing w:after="0"/>
+            </w:pPr>
+            <w:r>
+              <w:t xml:space="preserve">Object Oriented Programming</w:t>
+            </w:r>
+          </w:p>
+        </w:tc>
+        <w:tc>
+          <w:tcPr>
+            <w:tcW w:w="338" w:type="pct"/>
+          </w:tcPr>
+          <w:p>
+            <w:pPr>
+              <w:keepNext/>
+              <w:keepLines/>
+              <w:bidi w:val="0"/>
+              <w:spacing w:after="0"/>
+            </w:pPr>
+            <w:r>
+              <w:t xml:space="preserve">66.0</w:t>
+            </w:r>
+          </w:p>
+        </w:tc>
+        <w:tc>
+          <w:tcPr>
+            <w:tcW w:w="339" w:type="pct"/>
+          </w:tcPr>
+          <w:p>
+            <w:pPr>
+              <w:keepNext/>
+              <w:keepLines/>
+              <w:bidi w:val="0"/>
+              <w:spacing w:after="0"/>
+            </w:pPr>
+            <w:r>
+              <w:t xml:space="preserve">3</w:t>
+            </w:r>
+          </w:p>
+        </w:tc>
+        <w:tc>
+          <w:tcPr>
+            <w:tcW w:w="1831" w:type="pct"/>
+          </w:tcPr>
+          <w:p>
+            <w:pPr>
+              <w:keepNext/>
+              <w:keepLines/>
+              <w:bidi w:val="0"/>
+              <w:spacing w:after="0"/>
+            </w:pPr>
+            <w:r>
+              <w:t xml:space="preserve">Compilers</w:t>
+            </w:r>
+          </w:p>
+        </w:tc>
+        <w:tc>
+          <w:tcPr>
+            <w:tcW w:w="339" w:type="pct"/>
+          </w:tcPr>
+          <w:p>
+            <w:pPr>
+              <w:keepNext/>
+              <w:keepLines/>
+              <w:bidi w:val="0"/>
+              <w:spacing w:after="0"/>
+            </w:pPr>
+            <w:r>
+              <w:t xml:space="preserve">58.0</w:t>
+            </w:r>
+          </w:p>
+        </w:tc>
+        <w:tc>
+          <w:tcPr>
+            <w:tcW w:w="325" w:type="pct"/>
+          </w:tcPr>
+          <w:p>
+            <w:pPr>
+              <w:keepNext/>
+              <w:keepLines/>
+              <w:bidi w:val="0"/>
+              <w:spacing w:after="0"/>
+            </w:pPr>
+            <w:r>
+              <w:t xml:space="preserve">4</w:t>
+            </w:r>
+          </w:p>
+        </w:tc>
+      </w:tr>
+      <w:tr>
+        <w:trPr>
+          <w:cantSplit/>
+        </w:trPr>
+        <w:tc>
+          <w:tcPr>
+            <w:tcW w:w="1828" w:type="pct"/>
+          </w:tcPr>
+          <w:p>
+            <w:pPr>
+              <w:keepNext/>
+              <w:keepLines/>
+              <w:bidi w:val="0"/>
+              <w:spacing w:after="0"/>
+            </w:pPr>
+            <w:r>
+              <w:t xml:space="preserve">Philosophy</w:t>
+            </w:r>
+          </w:p>
+        </w:tc>
+        <w:tc>
+          <w:tcPr>
+            <w:tcW w:w="338" w:type="pct"/>
+          </w:tcPr>
+          <w:p>
+            <w:pPr>
+              <w:keepNext/>
+              <w:keepLines/>
+              <w:bidi w:val="0"/>
+              <w:spacing w:after="0"/>
+            </w:pPr>
+            <w:r>
+              <w:t xml:space="preserve">59.0</w:t>
+            </w:r>
+          </w:p>
+        </w:tc>
+        <w:tc>
+          <w:tcPr>
+            <w:tcW w:w="339" w:type="pct"/>
+          </w:tcPr>
+          <w:p>
+            <w:pPr>
+              <w:keepNext/>
+              <w:keepLines/>
+              <w:bidi w:val="0"/>
+              <w:spacing w:after="0"/>
+            </w:pPr>
+            <w:r>
+              <w:t xml:space="preserve">2</w:t>
+            </w:r>
+          </w:p>
+        </w:tc>
+        <w:tc>
+          <w:tcPr>
+            <w:tcW w:w="1831" w:type="pct"/>
+          </w:tcPr>
+          <w:p>
+            <w:pPr>
+              <w:keepNext/>
+              <w:keepLines/>
+              <w:bidi w:val="0"/>
+              <w:spacing w:after="0"/>
+            </w:pPr>
+            <w:r>
+              <w:t xml:space="preserve">Computer Modeling and Simulation</w:t>
+            </w:r>
+          </w:p>
+        </w:tc>
+        <w:tc>
+          <w:tcPr>
+            <w:tcW w:w="339" w:type="pct"/>
+          </w:tcPr>
+          <w:p>
+            <w:pPr>
+              <w:keepNext/>
+              <w:keepLines/>
+              <w:bidi w:val="0"/>
+              <w:spacing w:after="0"/>
+            </w:pPr>
+            <w:r>
+              <w:t xml:space="preserve">78.0</w:t>
+            </w:r>
+          </w:p>
+        </w:tc>
+        <w:tc>
+          <w:tcPr>
+            <w:tcW w:w="325" w:type="pct"/>
+          </w:tcPr>
+          <w:p>
+            <w:pPr>
+              <w:keepNext/>
+              <w:keepLines/>
+              <w:bidi w:val="0"/>
+              <w:spacing w:after="0"/>
+            </w:pPr>
+            <w:r>
+              <w:t xml:space="preserve">3</w:t>
+            </w:r>
+          </w:p>
+        </w:tc>
+      </w:tr>
+      <w:tr>
+        <w:trPr>
+          <w:cantSplit/>
+        </w:trPr>
+        <w:tc>
+          <w:tcPr>
+            <w:tcW w:w="1828" w:type="pct"/>
+          </w:tcPr>
+          <w:p>
+            <w:pPr>
+              <w:keepNext/>
+              <w:keepLines/>
+              <w:bidi w:val="0"/>
+              <w:spacing w:after="0"/>
+            </w:pPr>
+            <w:r>
+              <w:t xml:space="preserve">Operations Research</w:t>
+            </w:r>
+          </w:p>
+        </w:tc>
+        <w:tc>
+          <w:tcPr>
+            <w:tcW w:w="338" w:type="pct"/>
+          </w:tcPr>
+          <w:p>
+            <w:pPr>
+              <w:keepNext/>
+              <w:keepLines/>
+              <w:bidi w:val="0"/>
+              <w:spacing w:after="0"/>
+            </w:pPr>
+            <w:r>
+              <w:t xml:space="preserve">60.0</w:t>
+            </w:r>
+          </w:p>
+        </w:tc>
+        <w:tc>
+          <w:tcPr>
+            <w:tcW w:w="339" w:type="pct"/>
+          </w:tcPr>
+          <w:p>
+            <w:pPr>
+              <w:keepNext/>
+              <w:keepLines/>
+              <w:bidi w:val="0"/>
+              <w:spacing w:after="0"/>
+            </w:pPr>
+            <w:r>
+              <w:t xml:space="preserve">3</w:t>
+            </w:r>
+          </w:p>
+        </w:tc>
+        <w:tc>
+          <w:tcPr>
+            <w:tcW w:w="1831" w:type="pct"/>
+          </w:tcPr>
+          <w:p>
+            <w:pPr>
+              <w:keepNext/>
+              <w:keepLines/>
+              <w:bidi w:val="0"/>
+              <w:spacing w:after="0"/>
+            </w:pPr>
+            <w:r>
+              <w:t xml:space="preserve">Web Design</w:t>
+            </w:r>
+          </w:p>
+        </w:tc>
+        <w:tc>
+          <w:tcPr>
+            <w:tcW w:w="339" w:type="pct"/>
+          </w:tcPr>
+          <w:p>
+            <w:pPr>
+              <w:keepNext/>
+              <w:keepLines/>
+              <w:bidi w:val="0"/>
+              <w:spacing w:after="0"/>
+            </w:pPr>
+            <w:r>
+              <w:t xml:space="preserve">56.0</w:t>
+            </w:r>
+          </w:p>
+        </w:tc>
+        <w:tc>
+          <w:tcPr>
+            <w:tcW w:w="325" w:type="pct"/>
+          </w:tcPr>
+          <w:p>
+            <w:pPr>
+              <w:keepNext/>
+              <w:keepLines/>
+              <w:bidi w:val="0"/>
+              <w:spacing w:after="0"/>
+            </w:pPr>
+            <w:r>
+              <w:t xml:space="preserve">3</w:t>
+            </w:r>
+          </w:p>
+        </w:tc>
+      </w:tr>
+      <w:tr>
+        <w:trPr>
+          <w:cantSplit/>
+        </w:trPr>
+        <w:tc>
+          <w:tcPr>
+            <w:tcW w:w="1828" w:type="pct"/>
+          </w:tcPr>
+          <w:p>
+            <w:pPr>
+              <w:keepNext/>
+              <w:keepLines/>
+              <w:bidi w:val="0"/>
+              <w:spacing w:after="0"/>
+            </w:pPr>
+            <w:r>
+              <w:t xml:space="preserve">Computer Networks I</w:t>
+            </w:r>
+          </w:p>
+        </w:tc>
+        <w:tc>
+          <w:tcPr>
+            <w:tcW w:w="338" w:type="pct"/>
+          </w:tcPr>
+          <w:p>
+            <w:pPr>
+              <w:keepNext/>
+              <w:keepLines/>
+              <w:bidi w:val="0"/>
+              <w:spacing w:after="0"/>
+            </w:pPr>
+            <w:r>
+              <w:t xml:space="preserve">63.0</w:t>
+            </w:r>
+          </w:p>
+        </w:tc>
+        <w:tc>
+          <w:tcPr>
+            <w:tcW w:w="339" w:type="pct"/>
+          </w:tcPr>
+          <w:p>
+            <w:pPr>
+              <w:keepNext/>
+              <w:keepLines/>
+              <w:bidi w:val="0"/>
+              <w:spacing w:after="0"/>
+            </w:pPr>
+            <w:r>
+              <w:t xml:space="preserve">3</w:t>
+            </w:r>
+          </w:p>
+        </w:tc>
+        <w:tc>
+          <w:tcPr>
+            <w:tcW w:w="1831" w:type="pct"/>
+          </w:tcPr>
+          <w:p>
+            <w:pPr>
+              <w:keepNext/>
+              <w:keepLines/>
+              <w:bidi w:val="0"/>
+              <w:spacing w:after="0"/>
+            </w:pPr>
+            <w:r>
+              <w:t xml:space="preserve">Data Structures I</w:t>
+            </w:r>
+          </w:p>
+        </w:tc>
+        <w:tc>
+          <w:tcPr>
+            <w:tcW w:w="339" w:type="pct"/>
+          </w:tcPr>
+          <w:p>
+            <w:pPr>
+              <w:keepNext/>
+              <w:keepLines/>
+              <w:bidi w:val="0"/>
+              <w:spacing w:after="0"/>
+            </w:pPr>
+            <w:r>
+              <w:t xml:space="preserve">56.0</w:t>
+            </w:r>
+          </w:p>
+        </w:tc>
+        <w:tc>
+          <w:tcPr>
+            <w:tcW w:w="325" w:type="pct"/>
+          </w:tcPr>
+          <w:p>
+            <w:pPr>
+              <w:keepNext/>
+              <w:keepLines/>
+              <w:bidi w:val="0"/>
+              <w:spacing w:after="0"/>
+            </w:pPr>
+            <w:r>
+              <w:t xml:space="preserve">3</w:t>
+            </w:r>
+          </w:p>
+        </w:tc>
+      </w:tr>
+      <w:tr>
+        <w:trPr>
+          <w:cantSplit/>
+        </w:trPr>
+        <w:tc>
+          <w:tcPr>
+            <w:tcW w:w="1828" w:type="pct"/>
+          </w:tcPr>
+          <w:p>
+            <w:pPr>
+              <w:keepNext/>
+              <w:keepLines/>
+              <w:bidi w:val="0"/>
+              <w:spacing w:after="0"/>
+            </w:pPr>
+            <w:r>
+              <w:t xml:space="preserve">Software Engineering</w:t>
+            </w:r>
+          </w:p>
+        </w:tc>
+        <w:tc>
+          <w:tcPr>
+            <w:tcW w:w="338" w:type="pct"/>
+          </w:tcPr>
+          <w:p>
+            <w:pPr>
+              <w:keepNext/>
+              <w:keepLines/>
+              <w:bidi w:val="0"/>
+              <w:spacing w:after="0"/>
+            </w:pPr>
+            <w:r>
+              <w:t xml:space="preserve">62.0</w:t>
+            </w:r>
+          </w:p>
+        </w:tc>
+        <w:tc>
+          <w:tcPr>
+            <w:tcW w:w="339" w:type="pct"/>
+          </w:tcPr>
+          <w:p>
+            <w:pPr>
+              <w:keepNext/>
+              <w:keepLines/>
+              <w:bidi w:val="0"/>
+              <w:spacing w:after="0"/>
+            </w:pPr>
+            <w:r>
+              <w:t xml:space="preserve">3</w:t>
+            </w:r>
+          </w:p>
+        </w:tc>
+        <w:tc>
+          <w:tcPr>
+            <w:tcW w:w="1831" w:type="pct"/>
+          </w:tcPr>
+          <w:p>
+            <w:pPr>
+              <w:keepNext/>
+              <w:keepLines/>
+              <w:bidi w:val="0"/>
+              <w:spacing w:after="0"/>
+            </w:pPr>
+            <w:r>
+              <w:t xml:space="preserve"/>
+            </w:r>
+          </w:p>
+        </w:tc>
+        <w:tc>
+          <w:tcPr>
+            <w:tcW w:w="339" w:type="pct"/>
+          </w:tcPr>
+          <w:p>
+            <w:pPr>
+              <w:keepNext/>
+              <w:keepLines/>
+              <w:bidi w:val="0"/>
+              <w:spacing w:after="0"/>
+            </w:pPr>
+            <w:r>
+              <w:t xml:space="preserve"/>
+            </w:r>
+          </w:p>
+        </w:tc>
+        <w:tc>
+          <w:tcPr>
+            <w:tcW w:w="325" w:type="pct"/>
+          </w:tcPr>
+          <w:p>
+            <w:pPr>
+              <w:keepNext/>
+              <w:keepLines/>
+              <w:bidi w:val="0"/>
+              <w:spacing w:after="0"/>
+            </w:pPr>
+            <w:r>
+              <w:t xml:space="preserve"/>
+            </w:r>
+          </w:p>
+        </w:tc>
+      </w:tr>
+    </w:tbl>
+    <w:p>
+      <w:pPr>
+        <w:keepNext/>
+        <w:keepLines/>
+        <w:bidi w:val="0"/>
+        <w:spacing w:line="240" w:lineRule="auto"/>
+      </w:pPr>
+      <w:r>
+        <w:t xml:space="preserve"/>
+      </w:r>
+    </w:p>
+    <w:tbl>
+      <w:tblPr>
+        <w:tblStyle w:val="TableGrid"/>
+        <w:tblW w:w="5000" w:type="pct"/>
+        <w:tblLayout w:type="fixed"/>
+        <w:tblLook w:val="04A0" w:firstRow="1" w:lastRow="0" w:firstColumn="1" w:lastColumn="0" w:noHBand="0" w:noVBand="1"/>
+      </w:tblPr>
+      <w:tblGrid>
+        <w:gridCol w:w="3822"/>
+        <w:gridCol w:w="707"/>
+        <w:gridCol w:w="709"/>
+        <w:gridCol w:w="3829"/>
+        <w:gridCol w:w="709"/>
+        <w:gridCol w:w="680"/>
+      </w:tblGrid>
+      <w:tr>
+        <w:trPr>
+          <w:cantSplit/>
+        </w:trPr>
+        <w:tc>
+          <w:tcPr>
+            <w:tcW w:w="2505" w:type="pct"/>
+            <w:gridSpan w:val="3"/>
+          </w:tcPr>
+          <w:p>
+            <w:pPr>
+              <w:keepNext/>
+              <w:keepLines/>
+              <w:bidi w:val="0"/>
+              <w:spacing w:after="0"/>
+            </w:pPr>
+            <w:r>
+              <w:t xml:space="preserve">Semester 7 - 2018-2019</w:t>
+            </w:r>
+          </w:p>
+        </w:tc>
+        <w:tc>
+          <w:tcPr>
+            <w:tcW w:w="2495" w:type="pct"/>
+            <w:gridSpan w:val="3"/>
+          </w:tcPr>
+          <w:p>
+            <w:pPr>
+              <w:keepNext/>
+              <w:keepLines/>
+              <w:bidi w:val="0"/>
+              <w:spacing w:after="0"/>
+            </w:pPr>
+            <w:r>
+              <w:t xml:space="preserve">Semester 8 - 2018-2019</w:t>
+            </w:r>
+          </w:p>
+        </w:tc>
+      </w:tr>
+      <w:tr>
+        <w:trPr>
+          <w:cantSplit/>
+        </w:trPr>
+        <w:tc>
+          <w:tcPr>
+            <w:tcW w:w="1828" w:type="pct"/>
+          </w:tcPr>
+          <w:p>
+            <w:pPr>
+              <w:keepNext/>
+              <w:keepLines/>
+              <w:bidi w:val="0"/>
+              <w:spacing w:after="0"/>
+            </w:pPr>
+            <w:r>
+              <w:t>Subject</w:t>
+            </w:r>
+          </w:p>
+        </w:tc>
+        <w:tc>
+          <w:tcPr>
+            <w:tcW w:w="338" w:type="pct"/>
+          </w:tcPr>
+          <w:p>
+            <w:pPr>
+              <w:keepNext/>
+              <w:keepLines/>
+              <w:bidi w:val="0"/>
+              <w:spacing w:after="0"/>
+            </w:pPr>
+            <w:r>
+              <w:t>Mark</w:t>
+            </w:r>
+          </w:p>
+        </w:tc>
+        <w:tc>
+          <w:tcPr>
+            <w:tcW w:w="339" w:type="pct"/>
+          </w:tcPr>
+          <w:p>
+            <w:pPr>
+              <w:keepNext/>
+              <w:keepLines/>
+              <w:bidi w:val="0"/>
+              <w:spacing w:after="0"/>
+            </w:pPr>
+            <w:r>
+              <w:t>Unit</w:t>
+            </w:r>
+          </w:p>
+        </w:tc>
+        <w:tc>
+          <w:tcPr>
+            <w:tcW w:w="1831" w:type="pct"/>
+          </w:tcPr>
+          <w:p>
+            <w:pPr>
+              <w:keepNext/>
+              <w:keepLines/>
+              <w:bidi w:val="0"/>
+              <w:spacing w:after="0"/>
+            </w:pPr>
+            <w:r>
+              <w:t>Subject</w:t>
+            </w:r>
+          </w:p>
+        </w:tc>
+        <w:tc>
+          <w:tcPr>
+            <w:tcW w:w="339" w:type="pct"/>
+          </w:tcPr>
+          <w:p>
+            <w:pPr>
+              <w:keepNext/>
+              <w:keepLines/>
+              <w:bidi w:val="0"/>
+              <w:spacing w:after="0"/>
+            </w:pPr>
+            <w:r>
+              <w:t>Mark</w:t>
+            </w:r>
+          </w:p>
+        </w:tc>
+        <w:tc>
+          <w:tcPr>
+            <w:tcW w:w="325" w:type="pct"/>
+          </w:tcPr>
+          <w:p>
+            <w:pPr>
+              <w:keepNext/>
+              <w:keepLines/>
+              <w:bidi w:val="0"/>
+              <w:spacing w:after="0"/>
+            </w:pPr>
+            <w:r>
+              <w:t xml:space="preserve">Unit</w:t>
+            </w:r>
+          </w:p>
+        </w:tc>
+      </w:tr>
+      <w:tr>
+        <w:trPr>
+          <w:cantSplit/>
+        </w:trPr>
+        <w:tc>
+          <w:tcPr>
+            <w:tcW w:w="1828" w:type="pct"/>
+          </w:tcPr>
+          <w:p>
+            <w:pPr>
+              <w:keepNext/>
+              <w:keepLines/>
+              <w:bidi w:val="0"/>
+              <w:spacing w:after="0"/>
+            </w:pPr>
+            <w:r>
+              <w:t xml:space="preserve">E-Business</w:t>
+            </w:r>
+          </w:p>
+        </w:tc>
+        <w:tc>
+          <w:tcPr>
+            <w:tcW w:w="338" w:type="pct"/>
+          </w:tcPr>
+          <w:p>
+            <w:pPr>
+              <w:keepNext/>
+              <w:keepLines/>
+              <w:bidi w:val="0"/>
+              <w:spacing w:after="0"/>
+            </w:pPr>
+            <w:r>
+              <w:t xml:space="preserve">53.0</w:t>
+            </w:r>
+          </w:p>
+        </w:tc>
+        <w:tc>
+          <w:tcPr>
+            <w:tcW w:w="339" w:type="pct"/>
+          </w:tcPr>
+          <w:p>
+            <w:pPr>
+              <w:keepNext/>
+              <w:keepLines/>
+              <w:bidi w:val="0"/>
+              <w:spacing w:after="0"/>
+            </w:pPr>
+            <w:r>
+              <w:t xml:space="preserve">2</w:t>
+            </w:r>
+          </w:p>
+        </w:tc>
+        <w:tc>
+          <w:tcPr>
+            <w:tcW w:w="1831" w:type="pct"/>
+          </w:tcPr>
+          <w:p>
+            <w:pPr>
+              <w:keepNext/>
+              <w:keepLines/>
+              <w:bidi w:val="0"/>
+              <w:spacing w:after="0"/>
+            </w:pPr>
+            <w:r>
+              <w:t xml:space="preserve">Network Security</w:t>
+            </w:r>
+          </w:p>
+        </w:tc>
+        <w:tc>
+          <w:tcPr>
+            <w:tcW w:w="339" w:type="pct"/>
+          </w:tcPr>
+          <w:p>
+            <w:pPr>
+              <w:keepNext/>
+              <w:keepLines/>
+              <w:bidi w:val="0"/>
+              <w:spacing w:after="0"/>
+            </w:pPr>
+            <w:r>
+              <w:t xml:space="preserve">83.0</w:t>
+            </w:r>
+          </w:p>
+        </w:tc>
+        <w:tc>
+          <w:tcPr>
+            <w:tcW w:w="325" w:type="pct"/>
+          </w:tcPr>
+          <w:p>
+            <w:pPr>
+              <w:keepNext/>
+              <w:keepLines/>
+              <w:bidi w:val="0"/>
+              <w:spacing w:after="0"/>
+            </w:pPr>
+            <w:r>
+              <w:t xml:space="preserve">3</w:t>
+            </w:r>
+          </w:p>
+        </w:tc>
+      </w:tr>
+      <w:tr>
+        <w:trPr>
+          <w:cantSplit/>
+        </w:trPr>
+        <w:tc>
+          <w:tcPr>
+            <w:tcW w:w="1828" w:type="pct"/>
+          </w:tcPr>
+          <w:p>
+            <w:pPr>
+              <w:keepNext/>
+              <w:keepLines/>
+              <w:bidi w:val="0"/>
+              <w:spacing w:after="0"/>
+            </w:pPr>
+            <w:r>
+              <w:t xml:space="preserve">Data Mining</w:t>
+            </w:r>
+          </w:p>
+        </w:tc>
+        <w:tc>
+          <w:tcPr>
+            <w:tcW w:w="338" w:type="pct"/>
+          </w:tcPr>
+          <w:p>
+            <w:pPr>
+              <w:keepNext/>
+              <w:keepLines/>
+              <w:bidi w:val="0"/>
+              <w:spacing w:after="0"/>
+            </w:pPr>
+            <w:r>
+              <w:t xml:space="preserve">50.0</w:t>
+            </w:r>
+          </w:p>
+        </w:tc>
+        <w:tc>
+          <w:tcPr>
+            <w:tcW w:w="339" w:type="pct"/>
+          </w:tcPr>
+          <w:p>
+            <w:pPr>
+              <w:keepNext/>
+              <w:keepLines/>
+              <w:bidi w:val="0"/>
+              <w:spacing w:after="0"/>
+            </w:pPr>
+            <w:r>
+              <w:t xml:space="preserve">2</w:t>
+            </w:r>
+          </w:p>
+        </w:tc>
+        <w:tc>
+          <w:tcPr>
+            <w:tcW w:w="1831" w:type="pct"/>
+          </w:tcPr>
+          <w:p>
+            <w:pPr>
+              <w:keepNext/>
+              <w:keepLines/>
+              <w:bidi w:val="0"/>
+              <w:spacing w:after="0"/>
+            </w:pPr>
+            <w:r>
+              <w:t xml:space="preserve">Data Visualization</w:t>
+            </w:r>
+          </w:p>
+        </w:tc>
+        <w:tc>
+          <w:tcPr>
+            <w:tcW w:w="339" w:type="pct"/>
+          </w:tcPr>
+          <w:p>
+            <w:pPr>
+              <w:keepNext/>
+              <w:keepLines/>
+              <w:bidi w:val="0"/>
+              <w:spacing w:after="0"/>
+            </w:pPr>
+            <w:r>
+              <w:t xml:space="preserve">76.0</w:t>
+            </w:r>
+          </w:p>
+        </w:tc>
+        <w:tc>
+          <w:tcPr>
+            <w:tcW w:w="325" w:type="pct"/>
+          </w:tcPr>
+          <w:p>
+            <w:pPr>
+              <w:keepNext/>
+              <w:keepLines/>
+              <w:bidi w:val="0"/>
+              <w:spacing w:after="0"/>
+            </w:pPr>
+            <w:r>
+              <w:t xml:space="preserve">3</w:t>
+            </w:r>
+          </w:p>
+        </w:tc>
+      </w:tr>
+      <w:tr>
+        <w:trPr>
+          <w:cantSplit/>
+        </w:trPr>
+        <w:tc>
+          <w:tcPr>
+            <w:tcW w:w="1828" w:type="pct"/>
+          </w:tcPr>
+          <w:p>
+            <w:pPr>
+              <w:keepNext/>
+              <w:keepLines/>
+              <w:bidi w:val="0"/>
+              <w:spacing w:after="0"/>
+            </w:pPr>
+            <w:r>
+              <w:t xml:space="preserve">Advanced Web Design</w:t>
+            </w:r>
+          </w:p>
+        </w:tc>
+        <w:tc>
+          <w:tcPr>
+            <w:tcW w:w="338" w:type="pct"/>
+          </w:tcPr>
+          <w:p>
+            <w:pPr>
+              <w:keepNext/>
+              <w:keepLines/>
+              <w:bidi w:val="0"/>
+              <w:spacing w:after="0"/>
+            </w:pPr>
+            <w:r>
+              <w:t xml:space="preserve">58.0</w:t>
+            </w:r>
+          </w:p>
+        </w:tc>
+        <w:tc>
+          <w:tcPr>
+            <w:tcW w:w="339" w:type="pct"/>
+          </w:tcPr>
+          <w:p>
+            <w:pPr>
+              <w:keepNext/>
+              <w:keepLines/>
+              <w:bidi w:val="0"/>
+              <w:spacing w:after="0"/>
+            </w:pPr>
+            <w:r>
+              <w:t xml:space="preserve">3</w:t>
+            </w:r>
+          </w:p>
+        </w:tc>
+        <w:tc>
+          <w:tcPr>
+            <w:tcW w:w="1831" w:type="pct"/>
+          </w:tcPr>
+          <w:p>
+            <w:pPr>
+              <w:keepNext/>
+              <w:keepLines/>
+              <w:bidi w:val="0"/>
+              <w:spacing w:after="0"/>
+            </w:pPr>
+            <w:r>
+              <w:t xml:space="preserve">Computational Intelligence</w:t>
+            </w:r>
+          </w:p>
+        </w:tc>
+        <w:tc>
+          <w:tcPr>
+            <w:tcW w:w="339" w:type="pct"/>
+          </w:tcPr>
+          <w:p>
+            <w:pPr>
+              <w:keepNext/>
+              <w:keepLines/>
+              <w:bidi w:val="0"/>
+              <w:spacing w:after="0"/>
+            </w:pPr>
+            <w:r>
+              <w:t xml:space="preserve">68.0</w:t>
+            </w:r>
+          </w:p>
+        </w:tc>
+        <w:tc>
+          <w:tcPr>
+            <w:tcW w:w="325" w:type="pct"/>
+          </w:tcPr>
+          <w:p>
+            <w:pPr>
+              <w:keepNext/>
+              <w:keepLines/>
+              <w:bidi w:val="0"/>
+              <w:spacing w:after="0"/>
+            </w:pPr>
+            <w:r>
+              <w:t xml:space="preserve">3</w:t>
+            </w:r>
+          </w:p>
+        </w:tc>
+      </w:tr>
+      <w:tr>
+        <w:trPr>
+          <w:cantSplit/>
+        </w:trPr>
+        <w:tc>
+          <w:tcPr>
+            <w:tcW w:w="1828" w:type="pct"/>
+          </w:tcPr>
+          <w:p>
+            <w:pPr>
+              <w:keepNext/>
+              <w:keepLines/>
+              <w:bidi w:val="0"/>
+              <w:spacing w:after="0"/>
+            </w:pPr>
+            <w:r>
+              <w:t xml:space="preserve">Computer Networks II</w:t>
+            </w:r>
+          </w:p>
+        </w:tc>
+        <w:tc>
+          <w:tcPr>
+            <w:tcW w:w="338" w:type="pct"/>
+          </w:tcPr>
+          <w:p>
+            <w:pPr>
+              <w:keepNext/>
+              <w:keepLines/>
+              <w:bidi w:val="0"/>
+              <w:spacing w:after="0"/>
+            </w:pPr>
+            <w:r>
+              <w:t xml:space="preserve">75.0</w:t>
+            </w:r>
+          </w:p>
+        </w:tc>
+        <w:tc>
+          <w:tcPr>
+            <w:tcW w:w="339" w:type="pct"/>
+          </w:tcPr>
+          <w:p>
+            <w:pPr>
+              <w:keepNext/>
+              <w:keepLines/>
+              <w:bidi w:val="0"/>
+              <w:spacing w:after="0"/>
+            </w:pPr>
+            <w:r>
+              <w:t xml:space="preserve">3</w:t>
+            </w:r>
+          </w:p>
+        </w:tc>
+        <w:tc>
+          <w:tcPr>
+            <w:tcW w:w="1831" w:type="pct"/>
+          </w:tcPr>
+          <w:p>
+            <w:pPr>
+              <w:keepNext/>
+              <w:keepLines/>
+              <w:bidi w:val="0"/>
+              <w:spacing w:after="0"/>
+            </w:pPr>
+            <w:r>
+              <w:t xml:space="preserve">Senior Project I</w:t>
+            </w:r>
+          </w:p>
+        </w:tc>
+        <w:tc>
+          <w:tcPr>
+            <w:tcW w:w="339" w:type="pct"/>
+          </w:tcPr>
+          <w:p>
+            <w:pPr>
+              <w:keepNext/>
+              <w:keepLines/>
+              <w:bidi w:val="0"/>
+              <w:spacing w:after="0"/>
+            </w:pPr>
+            <w:r>
+              <w:t xml:space="preserve">89.0</w:t>
+            </w:r>
+          </w:p>
+        </w:tc>
+        <w:tc>
+          <w:tcPr>
+            <w:tcW w:w="325" w:type="pct"/>
+          </w:tcPr>
+          <w:p>
+            <w:pPr>
+              <w:keepNext/>
+              <w:keepLines/>
+              <w:bidi w:val="0"/>
+              <w:spacing w:after="0"/>
+            </w:pPr>
+            <w:r>
+              <w:t xml:space="preserve">2</w:t>
+            </w:r>
+          </w:p>
+        </w:tc>
+      </w:tr>
+      <w:tr>
+        <w:trPr>
+          <w:cantSplit/>
+        </w:trPr>
+        <w:tc>
+          <w:tcPr>
+            <w:tcW w:w="1828" w:type="pct"/>
+          </w:tcPr>
+          <w:p>
+            <w:pPr>
+              <w:keepNext/>
+              <w:keepLines/>
+              <w:bidi w:val="0"/>
+              <w:spacing w:after="0"/>
+            </w:pPr>
+            <w:r>
+              <w:t xml:space="preserve">Selected Topics</w:t>
+            </w:r>
+          </w:p>
+        </w:tc>
+        <w:tc>
+          <w:tcPr>
+            <w:tcW w:w="338" w:type="pct"/>
+          </w:tcPr>
+          <w:p>
+            <w:pPr>
+              <w:keepNext/>
+              <w:keepLines/>
+              <w:bidi w:val="0"/>
+              <w:spacing w:after="0"/>
+            </w:pPr>
+            <w:r>
+              <w:t xml:space="preserve">55.0</w:t>
+            </w:r>
+          </w:p>
+        </w:tc>
+        <w:tc>
+          <w:tcPr>
+            <w:tcW w:w="339" w:type="pct"/>
+          </w:tcPr>
+          <w:p>
+            <w:pPr>
+              <w:keepNext/>
+              <w:keepLines/>
+              <w:bidi w:val="0"/>
+              <w:spacing w:after="0"/>
+            </w:pPr>
+            <w:r>
+              <w:t xml:space="preserve">3</w:t>
+            </w:r>
+          </w:p>
+        </w:tc>
+        <w:tc>
+          <w:tcPr>
+            <w:tcW w:w="1831" w:type="pct"/>
+          </w:tcPr>
+          <w:p>
+            <w:pPr>
+              <w:keepNext/>
+              <w:keepLines/>
+              <w:bidi w:val="0"/>
+              <w:spacing w:after="0"/>
+            </w:pPr>
+            <w:r>
+              <w:t xml:space="preserve">Multimedia</w:t>
+            </w:r>
+          </w:p>
+        </w:tc>
+        <w:tc>
+          <w:tcPr>
+            <w:tcW w:w="339" w:type="pct"/>
+          </w:tcPr>
+          <w:p>
+            <w:pPr>
+              <w:keepNext/>
+              <w:keepLines/>
+              <w:bidi w:val="0"/>
+              <w:spacing w:after="0"/>
+            </w:pPr>
+            <w:r>
+              <w:t xml:space="preserve">68.0</w:t>
+            </w:r>
+          </w:p>
+        </w:tc>
+        <w:tc>
+          <w:tcPr>
+            <w:tcW w:w="325" w:type="pct"/>
+          </w:tcPr>
+          <w:p>
+            <w:pPr>
+              <w:keepNext/>
+              <w:keepLines/>
+              <w:bidi w:val="0"/>
+              <w:spacing w:after="0"/>
+            </w:pPr>
+            <w:r>
+              <w:t xml:space="preserve">3</w:t>
+            </w:r>
+          </w:p>
+        </w:tc>
+      </w:tr>
+      <w:tr>
+        <w:trPr>
+          <w:cantSplit/>
+        </w:trPr>
+        <w:tc>
+          <w:tcPr>
+            <w:tcW w:w="1828" w:type="pct"/>
+          </w:tcPr>
+          <w:p>
+            <w:pPr>
+              <w:keepNext/>
+              <w:keepLines/>
+              <w:bidi w:val="0"/>
+              <w:spacing w:after="0"/>
+            </w:pPr>
+            <w:r>
+              <w:t xml:space="preserve">Operating Systems</w:t>
+            </w:r>
+          </w:p>
+        </w:tc>
+        <w:tc>
+          <w:tcPr>
+            <w:tcW w:w="338" w:type="pct"/>
+          </w:tcPr>
+          <w:p>
+            <w:pPr>
+              <w:keepNext/>
+              <w:keepLines/>
+              <w:bidi w:val="0"/>
+              <w:spacing w:after="0"/>
+            </w:pPr>
+            <w:r>
+              <w:t xml:space="preserve">51.0</w:t>
+            </w:r>
+          </w:p>
+        </w:tc>
+        <w:tc>
+          <w:tcPr>
+            <w:tcW w:w="339" w:type="pct"/>
+          </w:tcPr>
+          <w:p>
+            <w:pPr>
+              <w:keepNext/>
+              <w:keepLines/>
+              <w:bidi w:val="0"/>
+              <w:spacing w:after="0"/>
+            </w:pPr>
+            <w:r>
+              <w:t xml:space="preserve">3</w:t>
+            </w:r>
+          </w:p>
+        </w:tc>
+        <w:tc>
+          <w:tcPr>
+            <w:tcW w:w="1831" w:type="pct"/>
+          </w:tcPr>
+          <w:p>
+            <w:pPr>
+              <w:keepNext/>
+              <w:keepLines/>
+              <w:bidi w:val="0"/>
+              <w:spacing w:after="0"/>
+            </w:pPr>
+            <w:r>
+              <w:t xml:space="preserve">Games Programming</w:t>
+            </w:r>
+          </w:p>
+        </w:tc>
+        <w:tc>
+          <w:tcPr>
+            <w:tcW w:w="339" w:type="pct"/>
+          </w:tcPr>
+          <w:p>
+            <w:pPr>
+              <w:keepNext/>
+              <w:keepLines/>
+              <w:bidi w:val="0"/>
+              <w:spacing w:after="0"/>
+            </w:pPr>
+            <w:r>
+              <w:t xml:space="preserve">62.0</w:t>
+            </w:r>
+          </w:p>
+        </w:tc>
+        <w:tc>
+          <w:tcPr>
+            <w:tcW w:w="325" w:type="pct"/>
+          </w:tcPr>
+          <w:p>
+            <w:pPr>
+              <w:keepNext/>
+              <w:keepLines/>
+              <w:bidi w:val="0"/>
+              <w:spacing w:after="0"/>
+            </w:pPr>
+            <w:r>
+              <w:t xml:space="preserve">2</w:t>
+            </w:r>
+          </w:p>
+        </w:tc>
+      </w:tr>
+      <w:tr>
+        <w:trPr>
+          <w:cantSplit/>
+        </w:trPr>
+        <w:tc>
+          <w:tcPr>
+            <w:tcW w:w="1828" w:type="pct"/>
+          </w:tcPr>
+          <w:p>
+            <w:pPr>
+              <w:keepNext/>
+              <w:keepLines/>
+              <w:bidi w:val="0"/>
+              <w:spacing w:after="0"/>
+            </w:pPr>
+            <w:r>
+              <w:t xml:space="preserve"/>
+            </w:r>
+          </w:p>
+        </w:tc>
+        <w:tc>
+          <w:tcPr>
+            <w:tcW w:w="338" w:type="pct"/>
+          </w:tcPr>
+          <w:p>
+            <w:pPr>
+              <w:keepNext/>
+              <w:keepLines/>
+              <w:bidi w:val="0"/>
+              <w:spacing w:after="0"/>
+            </w:pPr>
+            <w:r>
+              <w:t xml:space="preserve"/>
+            </w:r>
+          </w:p>
+        </w:tc>
+        <w:tc>
+          <w:tcPr>
+            <w:tcW w:w="339" w:type="pct"/>
+          </w:tcPr>
+          <w:p>
+            <w:pPr>
+              <w:keepNext/>
+              <w:keepLines/>
+              <w:bidi w:val="0"/>
+              <w:spacing w:after="0"/>
+            </w:pPr>
+            <w:r>
+              <w:t xml:space="preserve"/>
+            </w:r>
+          </w:p>
+        </w:tc>
+        <w:tc>
+          <w:tcPr>
+            <w:tcW w:w="1831" w:type="pct"/>
+          </w:tcPr>
+          <w:p>
+            <w:pPr>
+              <w:keepNext/>
+              <w:keepLines/>
+              <w:bidi w:val="0"/>
+              <w:spacing w:after="0"/>
+            </w:pPr>
+            <w:r>
+              <w:t xml:space="preserve">Distributed Database</w:t>
+            </w:r>
+          </w:p>
+        </w:tc>
+        <w:tc>
+          <w:tcPr>
+            <w:tcW w:w="339" w:type="pct"/>
+          </w:tcPr>
+          <w:p>
+            <w:pPr>
+              <w:keepNext/>
+              <w:keepLines/>
+              <w:bidi w:val="0"/>
+              <w:spacing w:after="0"/>
+            </w:pPr>
+            <w:r>
+              <w:t xml:space="preserve">64.0</w:t>
+            </w:r>
+          </w:p>
+        </w:tc>
+        <w:tc>
+          <w:tcPr>
+            <w:tcW w:w="325" w:type="pct"/>
+          </w:tcPr>
+          <w:p>
+            <w:pPr>
+              <w:keepNext/>
+              <w:keepLines/>
+              <w:bidi w:val="0"/>
+              <w:spacing w:after="0"/>
+            </w:pPr>
+            <w:r>
+              <w:t xml:space="preserve">3</w:t>
+            </w:r>
+          </w:p>
+        </w:tc>
+      </w:tr>
+      <w:tr>
+        <w:trPr>
+          <w:cantSplit/>
+        </w:trPr>
+        <w:tc>
+          <w:tcPr>
+            <w:tcW w:w="1828" w:type="pct"/>
+          </w:tcPr>
+          <w:p>
+            <w:pPr>
+              <w:keepNext/>
+              <w:keepLines/>
+              <w:bidi w:val="0"/>
+              <w:spacing w:after="0"/>
+            </w:pPr>
+            <w:r>
+              <w:t xml:space="preserve"/>
+            </w:r>
+          </w:p>
+        </w:tc>
+        <w:tc>
+          <w:tcPr>
+            <w:tcW w:w="338" w:type="pct"/>
+          </w:tcPr>
+          <w:p>
+            <w:pPr>
+              <w:keepNext/>
+              <w:keepLines/>
+              <w:bidi w:val="0"/>
+              <w:spacing w:after="0"/>
+            </w:pPr>
+            <w:r>
+              <w:t xml:space="preserve"/>
+            </w:r>
+          </w:p>
+        </w:tc>
+        <w:tc>
+          <w:tcPr>
+            <w:tcW w:w="339" w:type="pct"/>
+          </w:tcPr>
+          <w:p>
+            <w:pPr>
+              <w:keepNext/>
+              <w:keepLines/>
+              <w:bidi w:val="0"/>
+              <w:spacing w:after="0"/>
+            </w:pPr>
+            <w:r>
+              <w:t xml:space="preserve"/>
+            </w:r>
+          </w:p>
+        </w:tc>
+        <w:tc>
+          <w:tcPr>
+            <w:tcW w:w="1831" w:type="pct"/>
+          </w:tcPr>
+          <w:p>
+            <w:pPr>
+              <w:keepNext/>
+              <w:keepLines/>
+              <w:bidi w:val="0"/>
+              <w:spacing w:after="0"/>
+            </w:pPr>
+            <w:r>
+              <w:t xml:space="preserve">Advanced Operating Systems</w:t>
+            </w:r>
+          </w:p>
+        </w:tc>
+        <w:tc>
+          <w:tcPr>
+            <w:tcW w:w="339" w:type="pct"/>
+          </w:tcPr>
+          <w:p>
+            <w:pPr>
+              <w:keepNext/>
+              <w:keepLines/>
+              <w:bidi w:val="0"/>
+              <w:spacing w:after="0"/>
+            </w:pPr>
+            <w:r>
+              <w:t xml:space="preserve">56.0</w:t>
+            </w:r>
+          </w:p>
+        </w:tc>
+        <w:tc>
+          <w:tcPr>
+            <w:tcW w:w="325" w:type="pct"/>
+          </w:tcPr>
+          <w:p>
+            <w:pPr>
+              <w:keepNext/>
+              <w:keepLines/>
+              <w:bidi w:val="0"/>
+              <w:spacing w:after="0"/>
+            </w:pPr>
+            <w:r>
+              <w:t xml:space="preserve">2</w:t>
+            </w:r>
+          </w:p>
+        </w:tc>
+      </w:tr>
+    </w:tbl>
+    <w:p>
+      <w:pPr>
+        <w:keepNext/>
+        <w:keepLines/>
+        <w:bidi w:val="0"/>
+        <w:spacing w:line="240" w:lineRule="auto"/>
+      </w:pPr>
+      <w:r>
+        <w:t xml:space="preserve"/>
+      </w:r>
+    </w:p>
+    <w:tbl>
+      <w:tblPr>
+        <w:tblStyle w:val="TableGrid"/>
+        <w:tblW w:w="5000" w:type="pct"/>
+        <w:tblLayout w:type="fixed"/>
+        <w:tblLook w:val="04A0" w:firstRow="1" w:lastRow="0" w:firstColumn="1" w:lastColumn="0" w:noHBand="0" w:noVBand="1"/>
+      </w:tblPr>
+      <w:tblGrid>
+        <w:gridCol w:w="3822"/>
+        <w:gridCol w:w="707"/>
+        <w:gridCol w:w="709"/>
+        <w:gridCol w:w="3829"/>
+        <w:gridCol w:w="709"/>
+        <w:gridCol w:w="680"/>
+      </w:tblGrid>
+      <w:tr>
+        <w:trPr>
+          <w:cantSplit/>
+        </w:trPr>
+        <w:tc>
+          <w:tcPr>
+            <w:tcW w:w="2505" w:type="pct"/>
+            <w:gridSpan w:val="3"/>
+          </w:tcPr>
+          <w:p>
+            <w:pPr>
+              <w:keepNext/>
+              <w:keepLines/>
+              <w:bidi w:val="0"/>
+              <w:spacing w:after="0"/>
+            </w:pPr>
+            <w:r>
+              <w:t xml:space="preserve">Semester 9 - 2019-2020</w:t>
+            </w:r>
+          </w:p>
+        </w:tc>
+        <w:tc>
+          <w:tcPr>
+            <w:tcW w:w="2495" w:type="pct"/>
+            <w:gridSpan w:val="3"/>
+          </w:tcPr>
+          <w:p>
+            <w:pPr>
+              <w:keepNext/>
+              <w:keepLines/>
+              <w:bidi w:val="0"/>
+              <w:spacing w:after="0"/>
+            </w:pPr>
+            <w:r>
+              <w:t xml:space="preserve"/>
+            </w:r>
+          </w:p>
+        </w:tc>
+      </w:tr>
+      <w:tr>
+        <w:trPr>
+          <w:cantSplit/>
+        </w:trPr>
+        <w:tc>
+          <w:tcPr>
+            <w:tcW w:w="1828" w:type="pct"/>
+          </w:tcPr>
+          <w:p>
+            <w:pPr>
+              <w:keepNext/>
+              <w:keepLines/>
+              <w:bidi w:val="0"/>
+              <w:spacing w:after="0"/>
+            </w:pPr>
+            <w:r>
+              <w:t>Subject</w:t>
+            </w:r>
+          </w:p>
+        </w:tc>
+        <w:tc>
+          <w:tcPr>
+            <w:tcW w:w="338" w:type="pct"/>
+          </w:tcPr>
+          <w:p>
+            <w:pPr>
+              <w:keepNext/>
+              <w:keepLines/>
+              <w:bidi w:val="0"/>
+              <w:spacing w:after="0"/>
+            </w:pPr>
+            <w:r>
+              <w:t>Mark</w:t>
+            </w:r>
+          </w:p>
+        </w:tc>
+        <w:tc>
+          <w:tcPr>
+            <w:tcW w:w="339" w:type="pct"/>
+          </w:tcPr>
+          <w:p>
+            <w:pPr>
+              <w:keepNext/>
+              <w:keepLines/>
+              <w:bidi w:val="0"/>
+              <w:spacing w:after="0"/>
+            </w:pPr>
+            <w:r>
+              <w:t>Unit</w:t>
+            </w:r>
+          </w:p>
+        </w:tc>
+        <w:tc>
+          <w:tcPr>
+            <w:tcW w:w="1831" w:type="pct"/>
+          </w:tcPr>
+          <w:p>
+            <w:pPr>
+              <w:keepNext/>
+              <w:keepLines/>
+              <w:bidi w:val="0"/>
+              <w:spacing w:after="0"/>
+            </w:pPr>
+            <w:r>
+              <w:t>Subject</w:t>
+            </w:r>
+          </w:p>
+        </w:tc>
+        <w:tc>
+          <w:tcPr>
+            <w:tcW w:w="339" w:type="pct"/>
+          </w:tcPr>
+          <w:p>
+            <w:pPr>
+              <w:keepNext/>
+              <w:keepLines/>
+              <w:bidi w:val="0"/>
+              <w:spacing w:after="0"/>
+            </w:pPr>
+            <w:r>
+              <w:t>Mark</w:t>
+            </w:r>
+          </w:p>
+        </w:tc>
+        <w:tc>
+          <w:tcPr>
+            <w:tcW w:w="325" w:type="pct"/>
+          </w:tcPr>
+          <w:p>
+            <w:pPr>
+              <w:keepNext/>
+              <w:keepLines/>
+              <w:bidi w:val="0"/>
+              <w:spacing w:after="0"/>
+            </w:pPr>
+            <w:r>
+              <w:t xml:space="preserve">Unit</w:t>
+            </w:r>
+          </w:p>
+        </w:tc>
+      </w:tr>
+      <w:tr>
+        <w:trPr>
+          <w:cantSplit/>
+        </w:trPr>
+        <w:tc>
+          <w:tcPr>
+            <w:tcW w:w="1828" w:type="pct"/>
+          </w:tcPr>
+          <w:p>
+            <w:pPr>
+              <w:keepNext/>
+              <w:keepLines/>
+              <w:bidi w:val="0"/>
+              <w:spacing w:after="0"/>
+            </w:pPr>
+            <w:r>
+              <w:t xml:space="preserve">Cloud Computing</w:t>
+            </w:r>
+          </w:p>
+        </w:tc>
+        <w:tc>
+          <w:tcPr>
+            <w:tcW w:w="338" w:type="pct"/>
+          </w:tcPr>
+          <w:p>
+            <w:pPr>
+              <w:keepNext/>
+              <w:keepLines/>
+              <w:bidi w:val="0"/>
+              <w:spacing w:after="0"/>
+            </w:pPr>
+            <w:r>
+              <w:t xml:space="preserve">78.0</w:t>
+            </w:r>
+          </w:p>
+        </w:tc>
+        <w:tc>
+          <w:tcPr>
+            <w:tcW w:w="339" w:type="pct"/>
+          </w:tcPr>
+          <w:p>
+            <w:pPr>
+              <w:keepNext/>
+              <w:keepLines/>
+              <w:bidi w:val="0"/>
+              <w:spacing w:after="0"/>
+            </w:pPr>
+            <w:r>
+              <w:t xml:space="preserve">2</w:t>
+            </w:r>
+          </w:p>
+        </w:tc>
+        <w:tc>
+          <w:tcPr>
+            <w:tcW w:w="1831" w:type="pct"/>
+          </w:tcPr>
+          <w:p>
+            <w:pPr>
+              <w:keepNext/>
+              <w:keepLines/>
+              <w:bidi w:val="0"/>
+              <w:spacing w:after="0"/>
+            </w:pPr>
+            <w:r>
+              <w:t xml:space="preserve"/>
+            </w:r>
+          </w:p>
+        </w:tc>
+        <w:tc>
+          <w:tcPr>
+            <w:tcW w:w="339" w:type="pct"/>
+          </w:tcPr>
+          <w:p>
+            <w:pPr>
+              <w:keepNext/>
+              <w:keepLines/>
+              <w:bidi w:val="0"/>
+              <w:spacing w:after="0"/>
+            </w:pPr>
+            <w:r>
+              <w:t xml:space="preserve"/>
+            </w:r>
+          </w:p>
+        </w:tc>
+        <w:tc>
+          <w:tcPr>
+            <w:tcW w:w="325" w:type="pct"/>
+          </w:tcPr>
+          <w:p>
+            <w:pPr>
+              <w:keepNext/>
+              <w:keepLines/>
+              <w:bidi w:val="0"/>
+              <w:spacing w:after="0"/>
+            </w:pPr>
+            <w:r>
+              <w:t xml:space="preserve"/>
+            </w:r>
+          </w:p>
+        </w:tc>
+      </w:tr>
+      <w:tr>
+        <w:trPr>
+          <w:cantSplit/>
+        </w:trPr>
+        <w:tc>
+          <w:tcPr>
+            <w:tcW w:w="1828" w:type="pct"/>
+          </w:tcPr>
+          <w:p>
+            <w:pPr>
+              <w:keepNext/>
+              <w:keepLines/>
+              <w:bidi w:val="0"/>
+              <w:spacing w:after="0"/>
+            </w:pPr>
+            <w:r>
+              <w:t xml:space="preserve">Mobile Applications</w:t>
+            </w:r>
+          </w:p>
+        </w:tc>
+        <w:tc>
+          <w:tcPr>
+            <w:tcW w:w="338" w:type="pct"/>
+          </w:tcPr>
+          <w:p>
+            <w:pPr>
+              <w:keepNext/>
+              <w:keepLines/>
+              <w:bidi w:val="0"/>
+              <w:spacing w:after="0"/>
+            </w:pPr>
+            <w:r>
+              <w:t xml:space="preserve">98.0</w:t>
+            </w:r>
+          </w:p>
+        </w:tc>
+        <w:tc>
+          <w:tcPr>
+            <w:tcW w:w="339" w:type="pct"/>
+          </w:tcPr>
+          <w:p>
+            <w:pPr>
+              <w:keepNext/>
+              <w:keepLines/>
+              <w:bidi w:val="0"/>
+              <w:spacing w:after="0"/>
+            </w:pPr>
+            <w:r>
+              <w:t xml:space="preserve">3</w:t>
+            </w:r>
+          </w:p>
+        </w:tc>
+        <w:tc>
+          <w:tcPr>
+            <w:tcW w:w="1831" w:type="pct"/>
+          </w:tcPr>
+          <w:p>
+            <w:pPr>
+              <w:keepNext/>
+              <w:keepLines/>
+              <w:bidi w:val="0"/>
+              <w:spacing w:after="0"/>
+            </w:pPr>
+            <w:r>
+              <w:t xml:space="preserve"/>
+            </w:r>
+          </w:p>
+        </w:tc>
+        <w:tc>
+          <w:tcPr>
+            <w:tcW w:w="339" w:type="pct"/>
+          </w:tcPr>
+          <w:p>
+            <w:pPr>
+              <w:keepNext/>
+              <w:keepLines/>
+              <w:bidi w:val="0"/>
+              <w:spacing w:after="0"/>
+            </w:pPr>
+            <w:r>
+              <w:t xml:space="preserve"/>
+            </w:r>
+          </w:p>
+        </w:tc>
+        <w:tc>
+          <w:tcPr>
+            <w:tcW w:w="325" w:type="pct"/>
+          </w:tcPr>
+          <w:p>
+            <w:pPr>
+              <w:keepNext/>
+              <w:keepLines/>
+              <w:bidi w:val="0"/>
+              <w:spacing w:after="0"/>
+            </w:pPr>
+            <w:r>
+              <w:t xml:space="preserve"/>
+            </w:r>
+          </w:p>
+        </w:tc>
+      </w:tr>
+      <w:tr>
+        <w:trPr>
+          <w:cantSplit/>
+        </w:trPr>
+        <w:tc>
+          <w:tcPr>
+            <w:tcW w:w="1828" w:type="pct"/>
+          </w:tcPr>
+          <w:p>
+            <w:pPr>
+              <w:keepNext/>
+              <w:keepLines/>
+              <w:bidi w:val="0"/>
+              <w:spacing w:after="0"/>
+            </w:pPr>
+            <w:r>
+              <w:t xml:space="preserve">Communication Skills</w:t>
+            </w:r>
+          </w:p>
+        </w:tc>
+        <w:tc>
+          <w:tcPr>
+            <w:tcW w:w="338" w:type="pct"/>
+          </w:tcPr>
+          <w:p>
+            <w:pPr>
+              <w:keepNext/>
+              <w:keepLines/>
+              <w:bidi w:val="0"/>
+              <w:spacing w:after="0"/>
+            </w:pPr>
+            <w:r>
+              <w:t xml:space="preserve">87.0</w:t>
+            </w:r>
+          </w:p>
+        </w:tc>
+        <w:tc>
+          <w:tcPr>
+            <w:tcW w:w="339" w:type="pct"/>
+          </w:tcPr>
+          <w:p>
+            <w:pPr>
+              <w:keepNext/>
+              <w:keepLines/>
+              <w:bidi w:val="0"/>
+              <w:spacing w:after="0"/>
+            </w:pPr>
+            <w:r>
+              <w:t xml:space="preserve">2</w:t>
+            </w:r>
+          </w:p>
+        </w:tc>
+        <w:tc>
+          <w:tcPr>
+            <w:tcW w:w="1831" w:type="pct"/>
+          </w:tcPr>
+          <w:p>
+            <w:pPr>
+              <w:keepNext/>
+              <w:keepLines/>
+              <w:bidi w:val="0"/>
+              <w:spacing w:after="0"/>
+            </w:pPr>
+            <w:r>
+              <w:t xml:space="preserve"/>
+            </w:r>
+          </w:p>
+        </w:tc>
+        <w:tc>
+          <w:tcPr>
+            <w:tcW w:w="339" w:type="pct"/>
+          </w:tcPr>
+          <w:p>
+            <w:pPr>
+              <w:keepNext/>
+              <w:keepLines/>
+              <w:bidi w:val="0"/>
+              <w:spacing w:after="0"/>
+            </w:pPr>
+            <w:r>
+              <w:t xml:space="preserve"/>
+            </w:r>
+          </w:p>
+        </w:tc>
+        <w:tc>
+          <w:tcPr>
+            <w:tcW w:w="325" w:type="pct"/>
+          </w:tcPr>
+          <w:p>
+            <w:pPr>
+              <w:keepNext/>
+              <w:keepLines/>
+              <w:bidi w:val="0"/>
+              <w:spacing w:after="0"/>
+            </w:pPr>
+            <w:r>
+              <w:t xml:space="preserve"/>
+            </w:r>
+          </w:p>
+        </w:tc>
+      </w:tr>
+      <w:tr>
+        <w:trPr>
+          <w:cantSplit/>
+        </w:trPr>
+        <w:tc>
+          <w:tcPr>
+            <w:tcW w:w="1828" w:type="pct"/>
+          </w:tcPr>
+          <w:p>
+            <w:pPr>
+              <w:keepNext/>
+              <w:keepLines/>
+              <w:bidi w:val="0"/>
+              <w:spacing w:after="0"/>
+            </w:pPr>
+            <w:r>
+              <w:t xml:space="preserve">Information Theory</w:t>
+            </w:r>
+          </w:p>
+        </w:tc>
+        <w:tc>
+          <w:tcPr>
+            <w:tcW w:w="338" w:type="pct"/>
+          </w:tcPr>
+          <w:p>
+            <w:pPr>
+              <w:keepNext/>
+              <w:keepLines/>
+              <w:bidi w:val="0"/>
+              <w:spacing w:after="0"/>
+            </w:pPr>
+            <w:r>
+              <w:t xml:space="preserve">77.0</w:t>
+            </w:r>
+          </w:p>
+        </w:tc>
+        <w:tc>
+          <w:tcPr>
+            <w:tcW w:w="339" w:type="pct"/>
+          </w:tcPr>
+          <w:p>
+            <w:pPr>
+              <w:keepNext/>
+              <w:keepLines/>
+              <w:bidi w:val="0"/>
+              <w:spacing w:after="0"/>
+            </w:pPr>
+            <w:r>
+              <w:t xml:space="preserve">3</w:t>
+            </w:r>
+          </w:p>
+        </w:tc>
+        <w:tc>
+          <w:tcPr>
+            <w:tcW w:w="1831" w:type="pct"/>
+          </w:tcPr>
+          <w:p>
+            <w:pPr>
+              <w:keepNext/>
+              <w:keepLines/>
+              <w:bidi w:val="0"/>
+              <w:spacing w:after="0"/>
+            </w:pPr>
+            <w:r>
+              <w:t xml:space="preserve"/>
+            </w:r>
+          </w:p>
+        </w:tc>
+        <w:tc>
+          <w:tcPr>
+            <w:tcW w:w="339" w:type="pct"/>
+          </w:tcPr>
+          <w:p>
+            <w:pPr>
+              <w:keepNext/>
+              <w:keepLines/>
+              <w:bidi w:val="0"/>
+              <w:spacing w:after="0"/>
+            </w:pPr>
+            <w:r>
+              <w:t xml:space="preserve"/>
+            </w:r>
+          </w:p>
+        </w:tc>
+        <w:tc>
+          <w:tcPr>
+            <w:tcW w:w="325" w:type="pct"/>
+          </w:tcPr>
+          <w:p>
+            <w:pPr>
+              <w:keepNext/>
+              <w:keepLines/>
+              <w:bidi w:val="0"/>
+              <w:spacing w:after="0"/>
+            </w:pPr>
+            <w:r>
+              <w:t xml:space="preserve"/>
+            </w:r>
+          </w:p>
+        </w:tc>
+      </w:tr>
+    </w:tbl>
+    <w:p>
+      <w:pPr>
+        <w:keepNext/>
+        <w:keepLines/>
+        <w:bidi w:val="0"/>
+        <w:spacing w:line="240" w:lineRule="auto"/>
+      </w:pPr>
+      <w:r>
+        <w:t xml:space="preserve"/>
+      </w:r>
+    </w:p>
+    <w:p>
+      <w:pPr>
+        <w:bidi w:val="0"/>
+        <w:spacing w:line="240" w:lineRule="auto"/>
+      </w:pPr>
     </w:p>
     <w:p>
       <w:pPr>
@@ -723,7 +4759,7 @@
               <w:jc w:val="center"/>
             </w:pPr>
             <w:r>
-              <w:t xml:space="preserve"> Israa F. Abed</w:t>
+              <w:t xml:space="preserve">Asst. Prof. Dr. Haider K. Mehbes</w:t>
             </w:r>
           </w:p>
           <w:p>
@@ -732,7 +4768,7 @@
               <w:jc w:val="center"/>
             </w:pPr>
             <w:r>
-              <w:t xml:space="preserve">Graduate Officer</w:t>
+              <w:t xml:space="preserve">Vice Chancellor for Scientific Affairs</w:t>
             </w:r>
           </w:p>
         </w:tc>
@@ -792,7 +4828,7 @@
               <w:jc w:val="center"/>
             </w:pPr>
             <w:r>
-              <w:t xml:space="preserve">Asst. Prof. Dr. Haider K. Mehbes</w:t>
+              <w:t xml:space="preserve">Lecturer Dr. Mortaja A. Saary</w:t>
             </w:r>
           </w:p>
           <w:p>
@@ -801,7 +4837,7 @@
               <w:jc w:val="center"/>
             </w:pPr>
             <w:r>
-              <w:t xml:space="preserve">Vice Chancellor for Scientific Affairs</w:t>
+              <w:t xml:space="preserve">Director of Registration</w:t>
             </w:r>
           </w:p>
         </w:tc>
@@ -827,7 +4863,7 @@
           <w:footerReference w:type="default" r:id="rId10"/>
           <w:headerReference w:type="first" r:id="rId11"/>
           <w:pgSz w:w="11906" w:h="16838"/>
-          <w:pgMar w:top="720" w:right="720" w:bottom="284" w:left="720" w:header="283" w:footer="292" w:gutter="0"/>
+          <w:pgMar w:top="4253" w:right="720" w:bottom="284" w:left="720" w:header="283" w:footer="292" w:gutter="0"/>
           <w:cols w:space="708"/>
           <w:bidi/>
           <w:rtlGutter/>
@@ -896,7 +4932,7 @@
               <w:jc w:val="center"/>
             </w:pPr>
             <w:r>
-              <w:t xml:space="preserve"> </w:t>
+              <w:t xml:space="preserve"> Israa F. Abed</w:t>
             </w:r>
           </w:p>
           <w:p>
@@ -905,7 +4941,7 @@
               <w:jc w:val="center"/>
             </w:pPr>
             <w:r>
-              <w:t xml:space="preserve"/>
+              <w:t xml:space="preserve">Graduate Officer</w:t>
             </w:r>
           </w:p>
         </w:tc>
@@ -979,7 +5015,7 @@
         </w:rPr>
       </w:pPr>
       <w:r>
-        <w:t xml:space="preserve">The University order No: 15710/13/3 (EX: 2/13/18515) in 2020-11-17 (EX: 7/8/2018)</w:t>
+        <w:t xml:space="preserve">The University order No: 15710/13/3 in 2020-11-17</w:t>
       </w:r>
     </w:p>
     <w:p>
@@ -1087,7 +5123,7 @@
       </w:r>
       <w:r>
         <w:tab/>
-        <w:t>(90-100)</w:t>
+        <w:t xml:space="preserve">(90-100)</w:t>
       </w:r>
       <w:r>
         <w:tab/>
@@ -1108,7 +5144,23 @@
         </w:rPr>
       </w:pPr>
       <w:r>
-        <w:t>The Medium Of Instruction During The Entire Was English.</w:t>
+        <w:t xml:space="preserve">The Medium </w:t>
+      </w:r>
+      <w:proofErr w:type="gramStart"/>
+      <w:r>
+        <w:t>Of</w:t>
+      </w:r>
+      <w:proofErr w:type="gramEnd"/>
+      <w:r>
+        <w:t xml:space="preserve"> Instruction During </w:t>
+      </w:r>
+      <w:proofErr w:type="gramStart"/>
+      <w:r>
+        <w:t>The</w:t>
+      </w:r>
+      <w:proofErr w:type="gramEnd"/>
+      <w:r>
+        <w:t xml:space="preserve"> Entire Was English.</w:t>
       </w:r>
     </w:p>
     <w:p>
@@ -1127,7 +5179,15 @@
         </w:rPr>
       </w:pPr>
       <w:r>
-        <w:t>The Certificate is Free From Scratches and Corrections.</w:t>
+        <w:t xml:space="preserve">The Certificate is Free </w:t>
+      </w:r>
+      <w:proofErr w:type="gramStart"/>
+      <w:r>
+        <w:t>From</w:t>
+      </w:r>
+      <w:proofErr w:type="gramEnd"/>
+      <w:r>
+        <w:t xml:space="preserve"> Scratches and Corrections.</w:t>
       </w:r>
     </w:p>
     <w:p>
@@ -1193,7 +5253,12 @@
     </w:pPr>
     <w:r>
       <w:rPr>
-        <w:rtl/>
+        <w:lang w:bidi="ar-IQ"/>
+      </w:rPr>
+      <w:t xml:space="preserve"> </w:t>
+    </w:r>
+    <w:r>
+      <w:rPr>
         <w:lang w:bidi="ar-IQ"/>
       </w:rPr>
       <w:fldChar w:fldCharType="begin"/>
@@ -1208,6 +5273,60 @@
       <w:rPr>
         <w:lang w:bidi="ar-IQ"/>
       </w:rPr>
+      <w:instrText>PAGE</w:instrText>
+    </w:r>
+    <w:r>
+      <w:rPr>
+        <w:lang w:bidi="ar-IQ"/>
+      </w:rPr>
+      <w:instrText xml:space="preserve"> </w:instrText>
+    </w:r>
+    <w:r>
+      <w:rPr>
+        <w:lang w:bidi="ar-IQ"/>
+      </w:rPr>
+      <w:fldChar w:fldCharType="separate"/>
+    </w:r>
+    <w:r>
+      <w:rPr>
+        <w:lang w:bidi="ar-IQ"/>
+      </w:rPr>
+      <w:t>1</w:t>
+    </w:r>
+    <w:r>
+      <w:rPr>
+        <w:lang w:bidi="ar-IQ"/>
+      </w:rPr>
+      <w:fldChar w:fldCharType="end"/>
+    </w:r>
+    <w:r>
+      <w:rPr>
+        <w:lang w:bidi="ar-IQ"/>
+      </w:rPr>
+      <w:fldChar w:fldCharType="begin"/>
+    </w:r>
+    <w:r>
+      <w:rPr>
+        <w:lang w:bidi="ar-IQ"/>
+      </w:rPr>
+      <w:instrText xml:space="preserve"> = 1 - </w:instrText>
+    </w:r>
+    <w:r>
+      <w:rPr>
+        <w:lang w:bidi="ar-IQ"/>
+      </w:rPr>
+      <w:fldChar w:fldCharType="begin"/>
+    </w:r>
+    <w:r>
+      <w:rPr>
+        <w:lang w:bidi="ar-IQ"/>
+      </w:rPr>
+      <w:instrText xml:space="preserve"> </w:instrText>
+    </w:r>
+    <w:r>
+      <w:rPr>
+        <w:lang w:bidi="ar-IQ"/>
+      </w:rPr>
       <w:instrText>NUMPAGES</w:instrText>
     </w:r>
     <w:r>
@@ -1218,7 +5337,6 @@
     </w:r>
     <w:r>
       <w:rPr>
-        <w:rtl/>
         <w:lang w:bidi="ar-IQ"/>
       </w:rPr>
       <w:fldChar w:fldCharType="separate"/>
@@ -1228,11 +5346,10 @@
         <w:noProof/>
         <w:lang w:bidi="ar-IQ"/>
       </w:rPr>
-      <w:t>3</w:t>
+      <w:instrText>3</w:instrText>
     </w:r>
     <w:r>
       <w:rPr>
-        <w:rtl/>
         <w:lang w:bidi="ar-IQ"/>
       </w:rPr>
       <w:fldChar w:fldCharType="end"/>
@@ -1241,36 +5358,12 @@
       <w:rPr>
         <w:lang w:bidi="ar-IQ"/>
       </w:rPr>
-      <w:t xml:space="preserve"> - </w:t>
-    </w:r>
-    <w:r>
-      <w:rPr>
-        <w:lang w:bidi="ar-IQ"/>
-      </w:rPr>
-      <w:fldChar w:fldCharType="begin"/>
-    </w:r>
-    <w:r>
-      <w:rPr>
-        <w:lang w:bidi="ar-IQ"/>
-      </w:rPr>
       <w:instrText xml:space="preserve"> </w:instrText>
     </w:r>
     <w:r>
       <w:rPr>
         <w:lang w:bidi="ar-IQ"/>
       </w:rPr>
-      <w:instrText>PAGE</w:instrText>
-    </w:r>
-    <w:r>
-      <w:rPr>
-        <w:lang w:bidi="ar-IQ"/>
-      </w:rPr>
-      <w:instrText xml:space="preserve"> </w:instrText>
-    </w:r>
-    <w:r>
-      <w:rPr>
-        <w:lang w:bidi="ar-IQ"/>
-      </w:rPr>
       <w:fldChar w:fldCharType="separate"/>
     </w:r>
     <w:r>
@@ -1278,18 +5371,25 @@
         <w:noProof/>
         <w:lang w:bidi="ar-IQ"/>
       </w:rPr>
-      <w:t>1</w:t>
+      <w:t>-2</w:t>
     </w:r>
     <w:r>
       <w:rPr>
         <w:lang w:bidi="ar-IQ"/>
       </w:rPr>
       <w:fldChar w:fldCharType="end"/>
+    </w:r>
+    <w:r>
+      <w:rPr>
+        <w:lang w:bidi="ar-IQ"/>
+      </w:rPr>
+      <w:t xml:space="preserve">  </w:t>
     </w:r>
   </w:p>
   <w:p>
     <w:pPr>
       <w:pStyle w:val="Footer"/>
+      <w:bidi w:val="0"/>
       <w:jc w:val="center"/>
       <w:rPr>
         <w:lang w:bidi="ar-IQ"/>
@@ -1299,6 +5399,7 @@
   <w:p>
     <w:pPr>
       <w:pStyle w:val="Footer"/>
+      <w:bidi w:val="0"/>
       <w:jc w:val="center"/>
       <w:rPr>
         <w:lang w:bidi="ar-IQ"/>
@@ -1366,7 +5467,7 @@
       <w:rPr>
         <w:noProof/>
       </w:rPr>
-      <w:pict w14:anchorId="40E608AF">
+      <w:pict w14:anchorId="4DB68A4E">
         <v:shapetype id="_x0000_t75" coordsize="21600,21600" o:spt="75" o:preferrelative="t" path="m@4@5l@4@11@9@11@9@5xe" filled="f" stroked="f">
           <v:stroke joinstyle="miter"/>
           <v:formulas>
@@ -1526,7 +5627,7 @@
       <w:rPr>
         <w:noProof/>
       </w:rPr>
-      <w:pict w14:anchorId="53E7FB1D">
+      <w:pict w14:anchorId="6EE4B6E3">
         <v:shapetype id="_x0000_t75" coordsize="21600,21600" o:spt="75" o:preferrelative="t" path="m@4@5l@4@11@9@11@9@5xe" filled="f" stroked="f">
           <v:stroke joinstyle="miter"/>
           <v:formulas>
@@ -4995,6 +9096,19 @@
     <w:uiPriority w:val="99"/>
     <w:rsid w:val="00626DCE"/>
   </w:style>
+  <w:style w:type="character" w:styleId="HTMLCode">
+    <w:name w:val="HTML Code"/>
+    <w:basedOn w:val="DefaultParagraphFont"/>
+    <w:uiPriority w:val="99"/>
+    <w:semiHidden/>
+    <w:unhideWhenUsed/>
+    <w:rsid w:val="006C593B"/>
+    <w:rPr>
+      <w:rFonts w:ascii="Courier New" w:eastAsia="Times New Roman" w:hAnsi="Courier New" w:cs="Courier New"/>
+      <w:sz w:val="20"/>
+      <w:szCs w:val="20"/>
+    </w:rPr>
+  </w:style>
 </w:styles>
 </file>
 

</xml_diff>